<commit_message>
Update FloatingNav component with new HD bar & shield SVG, enhance styling for the floating navigation, and improve responsiveness. Adjust layout in page.jsx for better user experience. Update various document files for consistency.
</commit_message>
<xml_diff>
--- a/CHASE_LIST.docx
+++ b/CHASE_LIST.docx
@@ -28,7 +28,7 @@
           <w:sz w:val="20"/>
           <w:szCs w:val="20"/>
         </w:rPr>
-        <w:t xml:space="preserve">Last Updated: May 6, 2026 — end of session (tenth pass)</w:t>
+        <w:t xml:space="preserve">Last Updated: May 7, 2026 — end of session (eleventh pass)</w:t>
       </w:r>
     </w:p>
     <w:p>
@@ -48,9 +48,6 @@
       </w:r>
     </w:p>
     <w:p>
-      <w:pPr>
-        <w:spacing w:after="80" w:before="80"/>
-      </w:pPr>
       <w:r>
         <w:t xml:space="preserve"/>
       </w:r>
@@ -68,8 +65,8 @@
         </w:tblBorders>
       </w:tblPr>
       <w:tblGrid>
-        <w:gridCol w:w="600"/>
-        <w:gridCol w:w="2520"/>
+        <w:gridCol w:w="480"/>
+        <w:gridCol w:w="2640"/>
         <w:gridCol w:w="6240"/>
       </w:tblGrid>
       <w:tr>
@@ -78,7 +75,7 @@
         </w:trPr>
         <w:tc>
           <w:tcPr>
-            <w:tcW w:type="dxa" w:w="600"/>
+            <w:tcW w:type="dxa" w:w="480"/>
             <w:tcBorders>
               <w:top w:val="single" w:color="CCCCCC" w:sz="1"/>
               <w:left w:val="single" w:color="CCCCCC" w:sz="1"/>
@@ -109,7 +106,7 @@
         </w:tc>
         <w:tc>
           <w:tcPr>
-            <w:tcW w:type="dxa" w:w="2520"/>
+            <w:tcW w:type="dxa" w:w="2640"/>
             <w:tcBorders>
               <w:top w:val="single" w:color="CCCCCC" w:sz="1"/>
               <w:left w:val="single" w:color="CCCCCC" w:sz="1"/>
@@ -173,7 +170,7 @@
       <w:tr>
         <w:tc>
           <w:tcPr>
-            <w:tcW w:type="dxa" w:w="600"/>
+            <w:tcW w:type="dxa" w:w="480"/>
             <w:tcBorders>
               <w:top w:val="single" w:color="CCCCCC" w:sz="1"/>
               <w:left w:val="single" w:color="CCCCCC" w:sz="1"/>
@@ -201,14 +198,100 @@
         </w:tc>
         <w:tc>
           <w:tcPr>
-            <w:tcW w:type="dxa" w:w="2520"/>
-            <w:tcBorders>
-              <w:top w:val="single" w:color="CCCCCC" w:sz="1"/>
-              <w:left w:val="single" w:color="CCCCCC" w:sz="1"/>
-              <w:bottom w:val="single" w:color="CCCCCC" w:sz="1"/>
-              <w:right w:val="single" w:color="CCCCCC" w:sz="1"/>
-            </w:tcBorders>
-            <w:shd w:fill="F9F9F9" w:val="clear"/>
+            <w:tcW w:type="dxa" w:w="2640"/>
+            <w:tcBorders>
+              <w:top w:val="single" w:color="CCCCCC" w:sz="1"/>
+              <w:left w:val="single" w:color="CCCCCC" w:sz="1"/>
+              <w:bottom w:val="single" w:color="CCCCCC" w:sz="1"/>
+              <w:right w:val="single" w:color="CCCCCC" w:sz="1"/>
+            </w:tcBorders>
+            <w:shd w:fill="F9F9F9" w:val="clear"/>
+            <w:tcMar>
+              <w:top w:type="dxa" w:w="80"/>
+              <w:left w:type="dxa" w:w="120"/>
+              <w:bottom w:type="dxa" w:w="80"/>
+              <w:right w:type="dxa" w:w="120"/>
+            </w:tcMar>
+          </w:tcPr>
+          <w:p>
+            <w:r>
+              <w:rPr>
+                <w:rFonts w:ascii="Arial" w:cs="Arial" w:eastAsia="Arial" w:hAnsi="Arial"/>
+                <w:sz w:val="18"/>
+                <w:szCs w:val="18"/>
+              </w:rPr>
+              <w:t xml:space="preserve">Smoke visibility</w:t>
+            </w:r>
+          </w:p>
+        </w:tc>
+        <w:tc>
+          <w:tcPr>
+            <w:tcW w:type="dxa" w:w="6240"/>
+            <w:tcBorders>
+              <w:top w:val="single" w:color="CCCCCC" w:sz="1"/>
+              <w:left w:val="single" w:color="CCCCCC" w:sz="1"/>
+              <w:bottom w:val="single" w:color="CCCCCC" w:sz="1"/>
+              <w:right w:val="single" w:color="CCCCCC" w:sz="1"/>
+            </w:tcBorders>
+            <w:shd w:fill="F9F9F9" w:val="clear"/>
+            <w:tcMar>
+              <w:top w:type="dxa" w:w="80"/>
+              <w:left w:type="dxa" w:w="120"/>
+              <w:bottom w:type="dxa" w:w="80"/>
+              <w:right w:type="dxa" w:w="120"/>
+            </w:tcMar>
+          </w:tcPr>
+          <w:p>
+            <w:r>
+              <w:rPr>
+                <w:rFonts w:ascii="Arial" w:cs="Arial" w:eastAsia="Arial" w:hAnsi="Arial"/>
+                <w:sz w:val="18"/>
+                <w:szCs w:val="18"/>
+              </w:rPr>
+              <w:t xml:space="preserve">May need maxAlpha increase in SmokeBackground.jsx. Check z-index stack if still invisible.</w:t>
+            </w:r>
+          </w:p>
+        </w:tc>
+      </w:tr>
+      <w:tr>
+        <w:tc>
+          <w:tcPr>
+            <w:tcW w:type="dxa" w:w="480"/>
+            <w:tcBorders>
+              <w:top w:val="single" w:color="CCCCCC" w:sz="1"/>
+              <w:left w:val="single" w:color="CCCCCC" w:sz="1"/>
+              <w:bottom w:val="single" w:color="CCCCCC" w:sz="1"/>
+              <w:right w:val="single" w:color="CCCCCC" w:sz="1"/>
+            </w:tcBorders>
+            <w:shd w:fill="FFFFFF" w:val="clear"/>
+            <w:tcMar>
+              <w:top w:type="dxa" w:w="80"/>
+              <w:left w:type="dxa" w:w="120"/>
+              <w:bottom w:type="dxa" w:w="80"/>
+              <w:right w:type="dxa" w:w="120"/>
+            </w:tcMar>
+          </w:tcPr>
+          <w:p>
+            <w:r>
+              <w:rPr>
+                <w:rFonts w:ascii="Arial" w:cs="Arial" w:eastAsia="Arial" w:hAnsi="Arial"/>
+                <w:sz w:val="18"/>
+                <w:szCs w:val="18"/>
+              </w:rPr>
+              <w:t xml:space="preserve">2</w:t>
+            </w:r>
+          </w:p>
+        </w:tc>
+        <w:tc>
+          <w:tcPr>
+            <w:tcW w:type="dxa" w:w="2640"/>
+            <w:tcBorders>
+              <w:top w:val="single" w:color="CCCCCC" w:sz="1"/>
+              <w:left w:val="single" w:color="CCCCCC" w:sz="1"/>
+              <w:bottom w:val="single" w:color="CCCCCC" w:sz="1"/>
+              <w:right w:val="single" w:color="CCCCCC" w:sz="1"/>
+            </w:tcBorders>
+            <w:shd w:fill="FFFFFF" w:val="clear"/>
             <w:tcMar>
               <w:top w:type="dxa" w:w="80"/>
               <w:left w:type="dxa" w:w="120"/>
@@ -236,116 +319,30 @@
               <w:bottom w:val="single" w:color="CCCCCC" w:sz="1"/>
               <w:right w:val="single" w:color="CCCCCC" w:sz="1"/>
             </w:tcBorders>
-            <w:shd w:fill="F9F9F9" w:val="clear"/>
-            <w:tcMar>
-              <w:top w:type="dxa" w:w="80"/>
-              <w:left w:type="dxa" w:w="120"/>
-              <w:bottom w:type="dxa" w:w="80"/>
-              <w:right w:type="dxa" w:w="120"/>
-            </w:tcMar>
-          </w:tcPr>
-          <w:p>
-            <w:r>
-              <w:rPr>
-                <w:rFonts w:ascii="Arial" w:cs="Arial" w:eastAsia="Arial" w:hAnsi="Arial"/>
-                <w:sz w:val="18"/>
-                <w:szCs w:val="18"/>
-              </w:rPr>
-              <w:t xml:space="preserve">Laken designing in Inkscape. Artboard sizes documented in handoff. Drop SVGs and wire in.</w:t>
-            </w:r>
-          </w:p>
-        </w:tc>
-      </w:tr>
-      <w:tr>
-        <w:tc>
-          <w:tcPr>
-            <w:tcW w:type="dxa" w:w="600"/>
-            <w:tcBorders>
-              <w:top w:val="single" w:color="CCCCCC" w:sz="1"/>
-              <w:left w:val="single" w:color="CCCCCC" w:sz="1"/>
-              <w:bottom w:val="single" w:color="CCCCCC" w:sz="1"/>
-              <w:right w:val="single" w:color="CCCCCC" w:sz="1"/>
-            </w:tcBorders>
-            <w:shd w:fill="FFFFFF" w:val="clear"/>
-            <w:tcMar>
-              <w:top w:type="dxa" w:w="80"/>
-              <w:left w:type="dxa" w:w="120"/>
-              <w:bottom w:type="dxa" w:w="80"/>
-              <w:right w:type="dxa" w:w="120"/>
-            </w:tcMar>
-          </w:tcPr>
-          <w:p>
-            <w:r>
-              <w:rPr>
-                <w:rFonts w:ascii="Arial" w:cs="Arial" w:eastAsia="Arial" w:hAnsi="Arial"/>
-                <w:sz w:val="18"/>
-                <w:szCs w:val="18"/>
-              </w:rPr>
-              <w:t xml:space="preserve">2</w:t>
-            </w:r>
-          </w:p>
-        </w:tc>
-        <w:tc>
-          <w:tcPr>
-            <w:tcW w:type="dxa" w:w="2520"/>
-            <w:tcBorders>
-              <w:top w:val="single" w:color="CCCCCC" w:sz="1"/>
-              <w:left w:val="single" w:color="CCCCCC" w:sz="1"/>
-              <w:bottom w:val="single" w:color="CCCCCC" w:sz="1"/>
-              <w:right w:val="single" w:color="CCCCCC" w:sz="1"/>
-            </w:tcBorders>
-            <w:shd w:fill="FFFFFF" w:val="clear"/>
-            <w:tcMar>
-              <w:top w:type="dxa" w:w="80"/>
-              <w:left w:type="dxa" w:w="120"/>
-              <w:bottom w:type="dxa" w:w="80"/>
-              <w:right w:type="dxa" w:w="120"/>
-            </w:tcMar>
-          </w:tcPr>
-          <w:p>
-            <w:r>
-              <w:rPr>
-                <w:rFonts w:ascii="Arial" w:cs="Arial" w:eastAsia="Arial" w:hAnsi="Arial"/>
-                <w:sz w:val="18"/>
-                <w:szCs w:val="18"/>
-              </w:rPr>
-              <w:t xml:space="preserve">Era slider SVGs</w:t>
-            </w:r>
-          </w:p>
-        </w:tc>
-        <w:tc>
-          <w:tcPr>
-            <w:tcW w:type="dxa" w:w="6240"/>
-            <w:tcBorders>
-              <w:top w:val="single" w:color="CCCCCC" w:sz="1"/>
-              <w:left w:val="single" w:color="CCCCCC" w:sz="1"/>
-              <w:bottom w:val="single" w:color="CCCCCC" w:sz="1"/>
-              <w:right w:val="single" w:color="CCCCCC" w:sz="1"/>
-            </w:tcBorders>
-            <w:shd w:fill="FFFFFF" w:val="clear"/>
-            <w:tcMar>
-              <w:top w:type="dxa" w:w="80"/>
-              <w:left w:type="dxa" w:w="120"/>
-              <w:bottom w:type="dxa" w:w="80"/>
-              <w:right w:type="dxa" w:w="120"/>
-            </w:tcMar>
-          </w:tcPr>
-          <w:p>
-            <w:r>
-              <w:rPr>
-                <w:rFonts w:ascii="Arial" w:cs="Arial" w:eastAsia="Arial" w:hAnsi="Arial"/>
-                <w:sz w:val="18"/>
-                <w:szCs w:val="18"/>
-              </w:rPr>
-              <w:t xml:space="preserve">Custom SVG per era node to replace gold circle placeholders. Provide as files.</w:t>
-            </w:r>
-          </w:p>
-        </w:tc>
-      </w:tr>
-      <w:tr>
-        <w:tc>
-          <w:tcPr>
-            <w:tcW w:type="dxa" w:w="600"/>
+            <w:shd w:fill="FFFFFF" w:val="clear"/>
+            <w:tcMar>
+              <w:top w:type="dxa" w:w="80"/>
+              <w:left w:type="dxa" w:w="120"/>
+              <w:bottom w:type="dxa" w:w="80"/>
+              <w:right w:type="dxa" w:w="120"/>
+            </w:tcMar>
+          </w:tcPr>
+          <w:p>
+            <w:r>
+              <w:rPr>
+                <w:rFonts w:ascii="Arial" w:cs="Arial" w:eastAsia="Arial" w:hAnsi="Arial"/>
+                <w:sz w:val="18"/>
+                <w:szCs w:val="18"/>
+              </w:rPr>
+              <w:t xml:space="preserve">Design at 1120×700px (16:10 ratio). Drop .webp files in public/images/eras/. Wire in via era.img field in eras.js.</w:t>
+            </w:r>
+          </w:p>
+        </w:tc>
+      </w:tr>
+      <w:tr>
+        <w:tc>
+          <w:tcPr>
+            <w:tcW w:type="dxa" w:w="480"/>
             <w:tcBorders>
               <w:top w:val="single" w:color="CCCCCC" w:sz="1"/>
               <w:left w:val="single" w:color="CCCCCC" w:sz="1"/>
@@ -373,7 +370,7 @@
         </w:tc>
         <w:tc>
           <w:tcPr>
-            <w:tcW w:type="dxa" w:w="2520"/>
+            <w:tcW w:type="dxa" w:w="2640"/>
             <w:tcBorders>
               <w:top w:val="single" w:color="CCCCCC" w:sz="1"/>
               <w:left w:val="single" w:color="CCCCCC" w:sz="1"/>
@@ -423,15 +420,15 @@
                 <w:sz w:val="18"/>
                 <w:szCs w:val="18"/>
               </w:rPr>
-              <w:t xml:space="preserve">Badge on cards with OEM numbers. Hover/click shows fitment or OEM. Mobile: bottom sheet.</w:t>
-            </w:r>
-          </w:p>
-        </w:tc>
-      </w:tr>
-      <w:tr>
-        <w:tc>
-          <w:tcPr>
-            <w:tcW w:type="dxa" w:w="600"/>
+              <w:t xml:space="preserve">Badge on product cards with oem_numbers. Hover/click shows fitment. Mobile: bottom sheet.</w:t>
+            </w:r>
+          </w:p>
+        </w:tc>
+      </w:tr>
+      <w:tr>
+        <w:tc>
+          <w:tcPr>
+            <w:tcW w:type="dxa" w:w="480"/>
             <w:tcBorders>
               <w:top w:val="single" w:color="CCCCCC" w:sz="1"/>
               <w:left w:val="single" w:color="CCCCCC" w:sz="1"/>
@@ -459,7 +456,7 @@
         </w:tc>
         <w:tc>
           <w:tcPr>
-            <w:tcW w:type="dxa" w:w="2520"/>
+            <w:tcW w:type="dxa" w:w="2640"/>
             <w:tcBorders>
               <w:top w:val="single" w:color="CCCCCC" w:sz="1"/>
               <w:left w:val="single" w:color="CCCCCC" w:sz="1"/>
@@ -517,7 +514,7 @@
       <w:tr>
         <w:tc>
           <w:tcPr>
-            <w:tcW w:type="dxa" w:w="600"/>
+            <w:tcW w:type="dxa" w:w="480"/>
             <w:tcBorders>
               <w:top w:val="single" w:color="CCCCCC" w:sz="1"/>
               <w:left w:val="single" w:color="CCCCCC" w:sz="1"/>
@@ -545,7 +542,7 @@
         </w:tc>
         <w:tc>
           <w:tcPr>
-            <w:tcW w:type="dxa" w:w="2520"/>
+            <w:tcW w:type="dxa" w:w="2640"/>
             <w:tcBorders>
               <w:top w:val="single" w:color="CCCCCC" w:sz="1"/>
               <w:left w:val="single" w:color="CCCCCC" w:sz="1"/>
@@ -595,15 +592,15 @@
                 <w:sz w:val="18"/>
                 <w:szCs w:val="18"/>
               </w:rPr>
-              <w:t xml:space="preserve">PDF in hand. Parse into vtwin_oem_crossref. Join to JW Boon via parsed_snapshot-&gt;&gt;’oem’.</w:t>
-            </w:r>
-          </w:p>
-        </w:tc>
-      </w:tr>
-      <w:tr>
-        <w:tc>
-          <w:tcPr>
-            <w:tcW w:type="dxa" w:w="600"/>
+              <w:t xml:space="preserve">PDF in hand. Parse into vtwin_oem_crossref. Join to JW Boon via parsed_snapshot-&gt;&gt;'oem'.</w:t>
+            </w:r>
+          </w:p>
+        </w:tc>
+      </w:tr>
+      <w:tr>
+        <w:tc>
+          <w:tcPr>
+            <w:tcW w:type="dxa" w:w="480"/>
             <w:tcBorders>
               <w:top w:val="single" w:color="CCCCCC" w:sz="1"/>
               <w:left w:val="single" w:color="CCCCCC" w:sz="1"/>
@@ -631,7 +628,7 @@
         </w:tc>
         <w:tc>
           <w:tcPr>
-            <w:tcW w:type="dxa" w:w="2520"/>
+            <w:tcW w:type="dxa" w:w="2640"/>
             <w:tcBorders>
               <w:top w:val="single" w:color="CCCCCC" w:sz="1"/>
               <w:left w:val="single" w:color="CCCCCC" w:sz="1"/>
@@ -681,15 +678,15 @@
                 <w:sz w:val="18"/>
                 <w:szCs w:val="18"/>
               </w:rPr>
-              <w:t xml:space="preserve">Scanned PDFs yielded 0 rows. Need text-based: 1991-92, 1995-96, 1998. Script ready.</w:t>
-            </w:r>
-          </w:p>
-        </w:tc>
-      </w:tr>
-      <w:tr>
-        <w:tc>
-          <w:tcPr>
-            <w:tcW w:type="dxa" w:w="600"/>
+              <w:t xml:space="preserve">1991-92, 1995-96, 1998 scanned. Script ready: build_oem_fitment_touring.mjs</w:t>
+            </w:r>
+          </w:p>
+        </w:tc>
+      </w:tr>
+      <w:tr>
+        <w:tc>
+          <w:tcPr>
+            <w:tcW w:type="dxa" w:w="480"/>
             <w:tcBorders>
               <w:top w:val="single" w:color="CCCCCC" w:sz="1"/>
               <w:left w:val="single" w:color="CCCCCC" w:sz="1"/>
@@ -717,7 +714,7 @@
         </w:tc>
         <w:tc>
           <w:tcPr>
-            <w:tcW w:type="dxa" w:w="2520"/>
+            <w:tcW w:type="dxa" w:w="2640"/>
             <w:tcBorders>
               <w:top w:val="single" w:color="CCCCCC" w:sz="1"/>
               <w:left w:val="single" w:color="CCCCCC" w:sz="1"/>
@@ -775,7 +772,7 @@
       <w:tr>
         <w:tc>
           <w:tcPr>
-            <w:tcW w:type="dxa" w:w="600"/>
+            <w:tcW w:type="dxa" w:w="480"/>
             <w:tcBorders>
               <w:top w:val="single" w:color="CCCCCC" w:sz="1"/>
               <w:left w:val="single" w:color="CCCCCC" w:sz="1"/>
@@ -803,65 +800,65 @@
         </w:tc>
         <w:tc>
           <w:tcPr>
-            <w:tcW w:type="dxa" w:w="2520"/>
-            <w:tcBorders>
-              <w:top w:val="single" w:color="CCCCCC" w:sz="1"/>
-              <w:left w:val="single" w:color="CCCCCC" w:sz="1"/>
-              <w:bottom w:val="single" w:color="CCCCCC" w:sz="1"/>
-              <w:right w:val="single" w:color="CCCCCC" w:sz="1"/>
-            </w:tcBorders>
-            <w:shd w:fill="FFFFFF" w:val="clear"/>
-            <w:tcMar>
-              <w:top w:type="dxa" w:w="80"/>
-              <w:left w:type="dxa" w:w="120"/>
-              <w:bottom w:type="dxa" w:w="80"/>
-              <w:right w:type="dxa" w:w="120"/>
-            </w:tcMar>
-          </w:tcPr>
-          <w:p>
-            <w:r>
-              <w:rPr>
-                <w:rFonts w:ascii="Arial" w:cs="Arial" w:eastAsia="Arial" w:hAnsi="Arial"/>
-                <w:sz w:val="18"/>
-                <w:szCs w:val="18"/>
-              </w:rPr>
-              <w:t xml:space="preserve">PU name-encoded fitment — second pass</w:t>
-            </w:r>
-          </w:p>
-        </w:tc>
-        <w:tc>
-          <w:tcPr>
-            <w:tcW w:type="dxa" w:w="6240"/>
-            <w:tcBorders>
-              <w:top w:val="single" w:color="CCCCCC" w:sz="1"/>
-              <w:left w:val="single" w:color="CCCCCC" w:sz="1"/>
-              <w:bottom w:val="single" w:color="CCCCCC" w:sz="1"/>
-              <w:right w:val="single" w:color="CCCCCC" w:sz="1"/>
-            </w:tcBorders>
-            <w:shd w:fill="FFFFFF" w:val="clear"/>
-            <w:tcMar>
-              <w:top w:type="dxa" w:w="80"/>
-              <w:left w:type="dxa" w:w="120"/>
-              <w:bottom w:type="dxa" w:w="80"/>
-              <w:right w:type="dxa" w:w="120"/>
-            </w:tcMar>
-          </w:tcPr>
-          <w:p>
-            <w:r>
-              <w:rPr>
-                <w:rFonts w:ascii="Arial" w:cs="Arial" w:eastAsia="Arial" w:hAnsi="Arial"/>
-                <w:sz w:val="18"/>
-                <w:szCs w:val="18"/>
-              </w:rPr>
-              <w:t xml:space="preserve">~86 unresolved after first pass. Manual audit or relaxed regex.</w:t>
-            </w:r>
-          </w:p>
-        </w:tc>
-      </w:tr>
-      <w:tr>
-        <w:tc>
-          <w:tcPr>
-            <w:tcW w:type="dxa" w:w="600"/>
+            <w:tcW w:type="dxa" w:w="2640"/>
+            <w:tcBorders>
+              <w:top w:val="single" w:color="CCCCCC" w:sz="1"/>
+              <w:left w:val="single" w:color="CCCCCC" w:sz="1"/>
+              <w:bottom w:val="single" w:color="CCCCCC" w:sz="1"/>
+              <w:right w:val="single" w:color="CCCCCC" w:sz="1"/>
+            </w:tcBorders>
+            <w:shd w:fill="FFFFFF" w:val="clear"/>
+            <w:tcMar>
+              <w:top w:type="dxa" w:w="80"/>
+              <w:left w:type="dxa" w:w="120"/>
+              <w:bottom w:type="dxa" w:w="80"/>
+              <w:right w:type="dxa" w:w="120"/>
+            </w:tcMar>
+          </w:tcPr>
+          <w:p>
+            <w:r>
+              <w:rPr>
+                <w:rFonts w:ascii="Arial" w:cs="Arial" w:eastAsia="Arial" w:hAnsi="Arial"/>
+                <w:sz w:val="18"/>
+                <w:szCs w:val="18"/>
+              </w:rPr>
+              <w:t xml:space="preserve">PU name-encoded fitment</w:t>
+            </w:r>
+          </w:p>
+        </w:tc>
+        <w:tc>
+          <w:tcPr>
+            <w:tcW w:type="dxa" w:w="6240"/>
+            <w:tcBorders>
+              <w:top w:val="single" w:color="CCCCCC" w:sz="1"/>
+              <w:left w:val="single" w:color="CCCCCC" w:sz="1"/>
+              <w:bottom w:val="single" w:color="CCCCCC" w:sz="1"/>
+              <w:right w:val="single" w:color="CCCCCC" w:sz="1"/>
+            </w:tcBorders>
+            <w:shd w:fill="FFFFFF" w:val="clear"/>
+            <w:tcMar>
+              <w:top w:type="dxa" w:w="80"/>
+              <w:left w:type="dxa" w:w="120"/>
+              <w:bottom w:type="dxa" w:w="80"/>
+              <w:right w:type="dxa" w:w="120"/>
+            </w:tcMar>
+          </w:tcPr>
+          <w:p>
+            <w:r>
+              <w:rPr>
+                <w:rFonts w:ascii="Arial" w:cs="Arial" w:eastAsia="Arial" w:hAnsi="Arial"/>
+                <w:sz w:val="18"/>
+                <w:szCs w:val="18"/>
+              </w:rPr>
+              <w:t xml:space="preserve">~86 unresolved. Manual audit or relaxed regex.</w:t>
+            </w:r>
+          </w:p>
+        </w:tc>
+      </w:tr>
+      <w:tr>
+        <w:tc>
+          <w:tcPr>
+            <w:tcW w:type="dxa" w:w="480"/>
             <w:tcBorders>
               <w:top w:val="single" w:color="CCCCCC" w:sz="1"/>
               <w:left w:val="single" w:color="CCCCCC" w:sz="1"/>
@@ -889,7 +886,7 @@
         </w:tc>
         <w:tc>
           <w:tcPr>
-            <w:tcW w:type="dxa" w:w="2520"/>
+            <w:tcW w:type="dxa" w:w="2640"/>
             <w:tcBorders>
               <w:top w:val="single" w:color="CCCCCC" w:sz="1"/>
               <w:left w:val="single" w:color="CCCCCC" w:sz="1"/>
@@ -939,15 +936,15 @@
                 <w:sz w:val="18"/>
                 <w:szCs w:val="18"/>
               </w:rPr>
-              <w:t xml:space="preserve">public/images/eras/flathead.webp — 800x600px WebP. Only era image still missing.</w:t>
-            </w:r>
-          </w:p>
-        </w:tc>
-      </w:tr>
-      <w:tr>
-        <w:tc>
-          <w:tcPr>
-            <w:tcW w:type="dxa" w:w="600"/>
+              <w:t xml:space="preserve">public/images/eras/flathead.webp — 800x600px WebP. Only era image missing.</w:t>
+            </w:r>
+          </w:p>
+        </w:tc>
+      </w:tr>
+      <w:tr>
+        <w:tc>
+          <w:tcPr>
+            <w:tcW w:type="dxa" w:w="480"/>
             <w:tcBorders>
               <w:top w:val="single" w:color="CCCCCC" w:sz="1"/>
               <w:left w:val="single" w:color="CCCCCC" w:sz="1"/>
@@ -975,7 +972,7 @@
         </w:tc>
         <w:tc>
           <w:tcPr>
-            <w:tcW w:type="dxa" w:w="2520"/>
+            <w:tcW w:type="dxa" w:w="2640"/>
             <w:tcBorders>
               <w:top w:val="single" w:color="CCCCCC" w:sz="1"/>
               <w:left w:val="single" w:color="CCCCCC" w:sz="1"/>
@@ -1025,16 +1022,13 @@
                 <w:sz w:val="18"/>
                 <w:szCs w:val="18"/>
               </w:rPr>
-              <w:t xml:space="preserve">Light/gold/white theme. Do after fitment is solid.</w:t>
+              <w:t xml:space="preserve">Light/gold/white theme. Do after fitment solid.</w:t>
             </w:r>
           </w:p>
         </w:tc>
       </w:tr>
     </w:tbl>
     <w:p>
-      <w:pPr>
-        <w:spacing w:after="80" w:before="80"/>
-      </w:pPr>
       <w:r>
         <w:t xml:space="preserve"/>
       </w:r>
@@ -1052,13 +1046,10 @@
           <w:sz w:val="32"/>
           <w:szCs w:val="32"/>
         </w:rPr>
-        <w:t xml:space="preserve">✅ DONE MAY 6 — TENTH PASS</w:t>
-      </w:r>
-    </w:p>
-    <w:p>
-      <w:pPr>
-        <w:spacing w:after="80" w:before="80"/>
-      </w:pPr>
+        <w:t xml:space="preserve">✅ DONE MAY 7 — ELEVENTH PASS</w:t>
+      </w:r>
+    </w:p>
+    <w:p>
       <w:r>
         <w:t xml:space="preserve"/>
       </w:r>
@@ -1171,35 +1162,35 @@
                 <w:sz w:val="18"/>
                 <w:szCs w:val="18"/>
               </w:rPr>
-              <w:t xml:space="preserve">New bento homepage</w:t>
-            </w:r>
-          </w:p>
-        </w:tc>
-        <w:tc>
-          <w:tcPr>
-            <w:tcW w:type="dxa" w:w="6240"/>
-            <w:tcBorders>
-              <w:top w:val="single" w:color="CCCCCC" w:sz="1"/>
-              <w:left w:val="single" w:color="CCCCCC" w:sz="1"/>
-              <w:bottom w:val="single" w:color="CCCCCC" w:sz="1"/>
-              <w:right w:val="single" w:color="CCCCCC" w:sz="1"/>
-            </w:tcBorders>
-            <w:shd w:fill="F9F9F9" w:val="clear"/>
-            <w:tcMar>
-              <w:top w:type="dxa" w:w="80"/>
-              <w:left w:type="dxa" w:w="120"/>
-              <w:bottom w:type="dxa" w:w="80"/>
-              <w:right w:type="dxa" w:w="120"/>
-            </w:tcMar>
-          </w:tcPr>
-          <w:p>
-            <w:r>
-              <w:rPr>
-                <w:rFonts w:ascii="Arial" w:cs="Arial" w:eastAsia="Arial" w:hAnsi="Arial"/>
-                <w:sz w:val="18"/>
-                <w:szCs w:val="18"/>
-              </w:rPr>
-              <w:t xml:space="preserve">✅ app/page.jsx replaced — dark, animated, black/gold/white bento grid</w:t>
+              <w:t xml:space="preserve">Component split</w:t>
+            </w:r>
+          </w:p>
+        </w:tc>
+        <w:tc>
+          <w:tcPr>
+            <w:tcW w:type="dxa" w:w="6240"/>
+            <w:tcBorders>
+              <w:top w:val="single" w:color="CCCCCC" w:sz="1"/>
+              <w:left w:val="single" w:color="CCCCCC" w:sz="1"/>
+              <w:bottom w:val="single" w:color="CCCCCC" w:sz="1"/>
+              <w:right w:val="single" w:color="CCCCCC" w:sz="1"/>
+            </w:tcBorders>
+            <w:shd w:fill="F9F9F9" w:val="clear"/>
+            <w:tcMar>
+              <w:top w:type="dxa" w:w="80"/>
+              <w:left w:type="dxa" w:w="120"/>
+              <w:bottom w:type="dxa" w:w="80"/>
+              <w:right w:type="dxa" w:w="120"/>
+            </w:tcMar>
+          </w:tcPr>
+          <w:p>
+            <w:r>
+              <w:rPr>
+                <w:rFonts w:ascii="Arial" w:cs="Arial" w:eastAsia="Arial" w:hAnsi="Arial"/>
+                <w:sz w:val="18"/>
+                <w:szCs w:val="18"/>
+              </w:rPr>
+              <w:t xml:space="preserve">✅ page.jsx refactored into 5 components + shared eras.js</w:t>
             </w:r>
           </w:p>
         </w:tc>
@@ -1229,35 +1220,35 @@
                 <w:sz w:val="18"/>
                 <w:szCs w:val="18"/>
               </w:rPr>
-              <w:t xml:space="preserve">Floating pill nav</w:t>
-            </w:r>
-          </w:p>
-        </w:tc>
-        <w:tc>
-          <w:tcPr>
-            <w:tcW w:type="dxa" w:w="6240"/>
-            <w:tcBorders>
-              <w:top w:val="single" w:color="CCCCCC" w:sz="1"/>
-              <w:left w:val="single" w:color="CCCCCC" w:sz="1"/>
-              <w:bottom w:val="single" w:color="CCCCCC" w:sz="1"/>
-              <w:right w:val="single" w:color="CCCCCC" w:sz="1"/>
-            </w:tcBorders>
-            <w:shd w:fill="FFFFFF" w:val="clear"/>
-            <w:tcMar>
-              <w:top w:type="dxa" w:w="80"/>
-              <w:left w:type="dxa" w:w="120"/>
-              <w:bottom w:type="dxa" w:w="80"/>
-              <w:right w:type="dxa" w:w="120"/>
-            </w:tcMar>
-          </w:tcPr>
-          <w:p>
-            <w:r>
-              <w:rPr>
-                <w:rFonts w:ascii="Arial" w:cs="Arial" w:eastAsia="Arial" w:hAnsi="Arial"/>
-                <w:sz w:val="18"/>
-                <w:szCs w:val="18"/>
-              </w:rPr>
-              <w:t xml:space="preserve">✅ Logo 100px, gold border on scroll, 160px page padding to clear tiles</w:t>
+              <w:t xml:space="preserve">3D fan carousel</w:t>
+            </w:r>
+          </w:p>
+        </w:tc>
+        <w:tc>
+          <w:tcPr>
+            <w:tcW w:type="dxa" w:w="6240"/>
+            <w:tcBorders>
+              <w:top w:val="single" w:color="CCCCCC" w:sz="1"/>
+              <w:left w:val="single" w:color="CCCCCC" w:sz="1"/>
+              <w:bottom w:val="single" w:color="CCCCCC" w:sz="1"/>
+              <w:right w:val="single" w:color="CCCCCC" w:sz="1"/>
+            </w:tcBorders>
+            <w:shd w:fill="FFFFFF" w:val="clear"/>
+            <w:tcMar>
+              <w:top w:type="dxa" w:w="80"/>
+              <w:left w:type="dxa" w:w="120"/>
+              <w:bottom w:type="dxa" w:w="80"/>
+              <w:right w:type="dxa" w:w="120"/>
+            </w:tcMar>
+          </w:tcPr>
+          <w:p>
+            <w:r>
+              <w:rPr>
+                <w:rFonts w:ascii="Arial" w:cs="Arial" w:eastAsia="Arial" w:hAnsi="Arial"/>
+                <w:sz w:val="18"/>
+                <w:szCs w:val="18"/>
+              </w:rPr>
+              <w:t xml:space="preserve">✅ Cards fan bottom-right → top-left, rotateZ + diagonal translateX/Y</w:t>
             </w:r>
           </w:p>
         </w:tc>
@@ -1287,35 +1278,35 @@
                 <w:sz w:val="18"/>
                 <w:szCs w:val="18"/>
               </w:rPr>
-              <w:t xml:space="preserve">Year→Model search</w:t>
-            </w:r>
-          </w:p>
-        </w:tc>
-        <w:tc>
-          <w:tcPr>
-            <w:tcW w:type="dxa" w:w="6240"/>
-            <w:tcBorders>
-              <w:top w:val="single" w:color="CCCCCC" w:sz="1"/>
-              <w:left w:val="single" w:color="CCCCCC" w:sz="1"/>
-              <w:bottom w:val="single" w:color="CCCCCC" w:sz="1"/>
-              <w:right w:val="single" w:color="CCCCCC" w:sz="1"/>
-            </w:tcBorders>
-            <w:shd w:fill="F9F9F9" w:val="clear"/>
-            <w:tcMar>
-              <w:top w:type="dxa" w:w="80"/>
-              <w:left w:type="dxa" w:w="120"/>
-              <w:bottom w:type="dxa" w:w="80"/>
-              <w:right w:type="dxa" w:w="120"/>
-            </w:tcMar>
-          </w:tcPr>
-          <w:p>
-            <w:r>
-              <w:rPr>
-                <w:rFonts w:ascii="Arial" w:cs="Arial" w:eastAsia="Arial" w:hAnsi="Arial"/>
-                <w:sz w:val="18"/>
-                <w:szCs w:val="18"/>
-              </w:rPr>
-              <w:t xml:space="preserve">✅ Year dropdown → createPortal modal → /browse route</w:t>
+              <w:t xml:space="preserve">Scroll-driven carousel</w:t>
+            </w:r>
+          </w:p>
+        </w:tc>
+        <w:tc>
+          <w:tcPr>
+            <w:tcW w:type="dxa" w:w="6240"/>
+            <w:tcBorders>
+              <w:top w:val="single" w:color="CCCCCC" w:sz="1"/>
+              <w:left w:val="single" w:color="CCCCCC" w:sz="1"/>
+              <w:bottom w:val="single" w:color="CCCCCC" w:sz="1"/>
+              <w:right w:val="single" w:color="CCCCCC" w:sz="1"/>
+            </w:tcBorders>
+            <w:shd w:fill="F9F9F9" w:val="clear"/>
+            <w:tcMar>
+              <w:top w:type="dxa" w:w="80"/>
+              <w:left w:type="dxa" w:w="120"/>
+              <w:bottom w:type="dxa" w:w="80"/>
+              <w:right w:type="dxa" w:w="120"/>
+            </w:tcMar>
+          </w:tcPr>
+          <w:p>
+            <w:r>
+              <w:rPr>
+                <w:rFonts w:ascii="Arial" w:cs="Arial" w:eastAsia="Arial" w:hAnsi="Arial"/>
+                <w:sz w:val="18"/>
+                <w:szCs w:val="18"/>
+              </w:rPr>
+              <w:t xml:space="preserve">✅ Scrolling on tile advances/retreats cards, ~120px per step</w:t>
             </w:r>
           </w:p>
         </w:tc>
@@ -1345,35 +1336,35 @@
                 <w:sz w:val="18"/>
                 <w:szCs w:val="18"/>
               </w:rPr>
-              <w:t xml:space="preserve">Model search API</w:t>
-            </w:r>
-          </w:p>
-        </w:tc>
-        <w:tc>
-          <w:tcPr>
-            <w:tcW w:type="dxa" w:w="6240"/>
-            <w:tcBorders>
-              <w:top w:val="single" w:color="CCCCCC" w:sz="1"/>
-              <w:left w:val="single" w:color="CCCCCC" w:sz="1"/>
-              <w:bottom w:val="single" w:color="CCCCCC" w:sz="1"/>
-              <w:right w:val="single" w:color="CCCCCC" w:sz="1"/>
-            </w:tcBorders>
-            <w:shd w:fill="FFFFFF" w:val="clear"/>
-            <w:tcMar>
-              <w:top w:type="dxa" w:w="80"/>
-              <w:left w:type="dxa" w:w="120"/>
-              <w:bottom w:type="dxa" w:w="80"/>
-              <w:right w:type="dxa" w:w="120"/>
-            </w:tcMar>
-          </w:tcPr>
-          <w:p>
-            <w:r>
-              <w:rPr>
-                <w:rFonts w:ascii="Arial" w:cs="Arial" w:eastAsia="Arial" w:hAnsi="Arial"/>
-                <w:sz w:val="18"/>
-                <w:szCs w:val="18"/>
-              </w:rPr>
-              <w:t xml:space="preserve">✅ /api/models/search live — hd_year_model_master, IPv4 pg Pool</w:t>
+              <w:t xml:space="preserve">Era slug fix</w:t>
+            </w:r>
+          </w:p>
+        </w:tc>
+        <w:tc>
+          <w:tcPr>
+            <w:tcW w:type="dxa" w:w="6240"/>
+            <w:tcBorders>
+              <w:top w:val="single" w:color="CCCCCC" w:sz="1"/>
+              <w:left w:val="single" w:color="CCCCCC" w:sz="1"/>
+              <w:bottom w:val="single" w:color="CCCCCC" w:sz="1"/>
+              <w:right w:val="single" w:color="CCCCCC" w:sz="1"/>
+            </w:tcBorders>
+            <w:shd w:fill="FFFFFF" w:val="clear"/>
+            <w:tcMar>
+              <w:top w:type="dxa" w:w="80"/>
+              <w:left w:type="dxa" w:w="120"/>
+              <w:bottom w:type="dxa" w:w="80"/>
+              <w:right w:type="dxa" w:w="120"/>
+            </w:tcMar>
+          </w:tcPr>
+          <w:p>
+            <w:r>
+              <w:rPr>
+                <w:rFonts w:ascii="Arial" w:cs="Arial" w:eastAsia="Arial" w:hAnsi="Arial"/>
+                <w:sz w:val="18"/>
+                <w:szCs w:val="18"/>
+              </w:rPr>
+              <w:t xml:space="preserve">✅ evolution, evo-sportster, chopper — match lib/eras/config.ts</w:t>
             </w:r>
           </w:p>
         </w:tc>
@@ -1403,35 +1394,35 @@
                 <w:sz w:val="18"/>
                 <w:szCs w:val="18"/>
               </w:rPr>
-              <w:t xml:space="preserve">Era horizontal slider</w:t>
-            </w:r>
-          </w:p>
-        </w:tc>
-        <w:tc>
-          <w:tcPr>
-            <w:tcW w:type="dxa" w:w="6240"/>
-            <w:tcBorders>
-              <w:top w:val="single" w:color="CCCCCC" w:sz="1"/>
-              <w:left w:val="single" w:color="CCCCCC" w:sz="1"/>
-              <w:bottom w:val="single" w:color="CCCCCC" w:sz="1"/>
-              <w:right w:val="single" w:color="CCCCCC" w:sz="1"/>
-            </w:tcBorders>
-            <w:shd w:fill="F9F9F9" w:val="clear"/>
-            <w:tcMar>
-              <w:top w:type="dxa" w:w="80"/>
-              <w:left w:type="dxa" w:w="120"/>
-              <w:bottom w:type="dxa" w:w="80"/>
-              <w:right w:type="dxa" w:w="120"/>
-            </w:tcMar>
-          </w:tcPr>
-          <w:p>
-            <w:r>
-              <w:rPr>
-                <w:rFonts w:ascii="Arial" w:cs="Arial" w:eastAsia="Arial" w:hAnsi="Arial"/>
-                <w:sz w:val="18"/>
-                <w:szCs w:val="18"/>
-              </w:rPr>
-              <w:t xml:space="preserve">✅ 10 eras, drag-scroll, gold line, → /era/[slug]</w:t>
+              <w:t xml:space="preserve">Era image filenames</w:t>
+            </w:r>
+          </w:p>
+        </w:tc>
+        <w:tc>
+          <w:tcPr>
+            <w:tcW w:type="dxa" w:w="6240"/>
+            <w:tcBorders>
+              <w:top w:val="single" w:color="CCCCCC" w:sz="1"/>
+              <w:left w:val="single" w:color="CCCCCC" w:sz="1"/>
+              <w:bottom w:val="single" w:color="CCCCCC" w:sz="1"/>
+              <w:right w:val="single" w:color="CCCCCC" w:sz="1"/>
+            </w:tcBorders>
+            <w:shd w:fill="F9F9F9" w:val="clear"/>
+            <w:tcMar>
+              <w:top w:type="dxa" w:w="80"/>
+              <w:left w:type="dxa" w:w="120"/>
+              <w:bottom w:type="dxa" w:w="80"/>
+              <w:right w:type="dxa" w:w="120"/>
+            </w:tcMar>
+          </w:tcPr>
+          <w:p>
+            <w:r>
+              <w:rPr>
+                <w:rFonts w:ascii="Arial" w:cs="Arial" w:eastAsia="Arial" w:hAnsi="Arial"/>
+                <w:sz w:val="18"/>
+                <w:szCs w:val="18"/>
+              </w:rPr>
+              <w:t xml:space="preserve">✅ All 9 eras mapped to correct .webp filenames in eras.js</w:t>
             </w:r>
           </w:p>
         </w:tc>
@@ -1461,35 +1452,35 @@
                 <w:sz w:val="18"/>
                 <w:szCs w:val="18"/>
               </w:rPr>
-              <w:t xml:space="preserve">Fixed: next/image error</w:t>
-            </w:r>
-          </w:p>
-        </w:tc>
-        <w:tc>
-          <w:tcPr>
-            <w:tcW w:type="dxa" w:w="6240"/>
-            <w:tcBorders>
-              <w:top w:val="single" w:color="CCCCCC" w:sz="1"/>
-              <w:left w:val="single" w:color="CCCCCC" w:sz="1"/>
-              <w:bottom w:val="single" w:color="CCCCCC" w:sz="1"/>
-              <w:right w:val="single" w:color="CCCCCC" w:sz="1"/>
-            </w:tcBorders>
-            <w:shd w:fill="FFFFFF" w:val="clear"/>
-            <w:tcMar>
-              <w:top w:type="dxa" w:w="80"/>
-              <w:left w:type="dxa" w:w="120"/>
-              <w:bottom w:type="dxa" w:w="80"/>
-              <w:right w:type="dxa" w:w="120"/>
-            </w:tcMar>
-          </w:tcPr>
-          <w:p>
-            <w:r>
-              <w:rPr>
-                <w:rFonts w:ascii="Arial" w:cs="Arial" w:eastAsia="Arial" w:hAnsi="Arial"/>
-                <w:sz w:val="18"/>
-                <w:szCs w:val="18"/>
-              </w:rPr>
-              <w:t xml:space="preserve">✅ Replaced with plain &lt;img&gt; tag</w:t>
+              <w:t xml:space="preserve">Smoke background</w:t>
+            </w:r>
+          </w:p>
+        </w:tc>
+        <w:tc>
+          <w:tcPr>
+            <w:tcW w:type="dxa" w:w="6240"/>
+            <w:tcBorders>
+              <w:top w:val="single" w:color="CCCCCC" w:sz="1"/>
+              <w:left w:val="single" w:color="CCCCCC" w:sz="1"/>
+              <w:bottom w:val="single" w:color="CCCCCC" w:sz="1"/>
+              <w:right w:val="single" w:color="CCCCCC" w:sz="1"/>
+            </w:tcBorders>
+            <w:shd w:fill="FFFFFF" w:val="clear"/>
+            <w:tcMar>
+              <w:top w:type="dxa" w:w="80"/>
+              <w:left w:type="dxa" w:w="120"/>
+              <w:bottom w:type="dxa" w:w="80"/>
+              <w:right w:type="dxa" w:w="120"/>
+            </w:tcMar>
+          </w:tcPr>
+          <w:p>
+            <w:r>
+              <w:rPr>
+                <w:rFonts w:ascii="Arial" w:cs="Arial" w:eastAsia="Arial" w:hAnsi="Arial"/>
+                <w:sz w:val="18"/>
+                <w:szCs w:val="18"/>
+              </w:rPr>
+              <w:t xml:space="preserve">✅ Canvas animation, fixed full-page, z-index 1</w:t>
             </w:r>
           </w:p>
         </w:tc>
@@ -1519,35 +1510,35 @@
                 <w:sz w:val="18"/>
                 <w:szCs w:val="18"/>
               </w:rPr>
-              <w:t xml:space="preserve">Fixed: IPv6 pg Pool ENOTFOUND</w:t>
-            </w:r>
-          </w:p>
-        </w:tc>
-        <w:tc>
-          <w:tcPr>
-            <w:tcW w:type="dxa" w:w="6240"/>
-            <w:tcBorders>
-              <w:top w:val="single" w:color="CCCCCC" w:sz="1"/>
-              <w:left w:val="single" w:color="CCCCCC" w:sz="1"/>
-              <w:bottom w:val="single" w:color="CCCCCC" w:sz="1"/>
-              <w:right w:val="single" w:color="CCCCCC" w:sz="1"/>
-            </w:tcBorders>
-            <w:shd w:fill="F9F9F9" w:val="clear"/>
-            <w:tcMar>
-              <w:top w:type="dxa" w:w="80"/>
-              <w:left w:type="dxa" w:w="120"/>
-              <w:bottom w:type="dxa" w:w="80"/>
-              <w:right w:type="dxa" w:w="120"/>
-            </w:tcMar>
-          </w:tcPr>
-          <w:p>
-            <w:r>
-              <w:rPr>
-                <w:rFonts w:ascii="Arial" w:cs="Arial" w:eastAsia="Arial" w:hAnsi="Arial"/>
-                <w:sz w:val="18"/>
-                <w:szCs w:val="18"/>
-              </w:rPr>
-              <w:t xml:space="preserve">✅ Switched to host/port/db params</w:t>
+              <w:t xml:space="preserve">Minimizing nav</w:t>
+            </w:r>
+          </w:p>
+        </w:tc>
+        <w:tc>
+          <w:tcPr>
+            <w:tcW w:type="dxa" w:w="6240"/>
+            <w:tcBorders>
+              <w:top w:val="single" w:color="CCCCCC" w:sz="1"/>
+              <w:left w:val="single" w:color="CCCCCC" w:sz="1"/>
+              <w:bottom w:val="single" w:color="CCCCCC" w:sz="1"/>
+              <w:right w:val="single" w:color="CCCCCC" w:sz="1"/>
+            </w:tcBorders>
+            <w:shd w:fill="F9F9F9" w:val="clear"/>
+            <w:tcMar>
+              <w:top w:type="dxa" w:w="80"/>
+              <w:left w:type="dxa" w:w="120"/>
+              <w:bottom w:type="dxa" w:w="80"/>
+              <w:right w:type="dxa" w:w="120"/>
+            </w:tcMar>
+          </w:tcPr>
+          <w:p>
+            <w:r>
+              <w:rPr>
+                <w:rFonts w:ascii="Arial" w:cs="Arial" w:eastAsia="Arial" w:hAnsi="Arial"/>
+                <w:sz w:val="18"/>
+                <w:szCs w:val="18"/>
+              </w:rPr>
+              <w:t xml:space="preserve">✅ Collapses to circular icon on scroll, restores on scroll up or click</w:t>
             </w:r>
           </w:p>
         </w:tc>
@@ -1577,35 +1568,35 @@
                 <w:sz w:val="18"/>
                 <w:szCs w:val="18"/>
               </w:rPr>
-              <w:t xml:space="preserve">Fixed: modal clipping in tile</w:t>
-            </w:r>
-          </w:p>
-        </w:tc>
-        <w:tc>
-          <w:tcPr>
-            <w:tcW w:type="dxa" w:w="6240"/>
-            <w:tcBorders>
-              <w:top w:val="single" w:color="CCCCCC" w:sz="1"/>
-              <w:left w:val="single" w:color="CCCCCC" w:sz="1"/>
-              <w:bottom w:val="single" w:color="CCCCCC" w:sz="1"/>
-              <w:right w:val="single" w:color="CCCCCC" w:sz="1"/>
-            </w:tcBorders>
-            <w:shd w:fill="FFFFFF" w:val="clear"/>
-            <w:tcMar>
-              <w:top w:type="dxa" w:w="80"/>
-              <w:left w:type="dxa" w:w="120"/>
-              <w:bottom w:type="dxa" w:w="80"/>
-              <w:right w:type="dxa" w:w="120"/>
-            </w:tcMar>
-          </w:tcPr>
-          <w:p>
-            <w:r>
-              <w:rPr>
-                <w:rFonts w:ascii="Arial" w:cs="Arial" w:eastAsia="Arial" w:hAnsi="Arial"/>
-                <w:sz w:val="18"/>
-                <w:szCs w:val="18"/>
-              </w:rPr>
-              <w:t xml:space="preserve">✅ createPortal to document.body, z-index 1000</w:t>
+              <w:t xml:space="preserve">Hydration fixes</w:t>
+            </w:r>
+          </w:p>
+        </w:tc>
+        <w:tc>
+          <w:tcPr>
+            <w:tcW w:type="dxa" w:w="6240"/>
+            <w:tcBorders>
+              <w:top w:val="single" w:color="CCCCCC" w:sz="1"/>
+              <w:left w:val="single" w:color="CCCCCC" w:sz="1"/>
+              <w:bottom w:val="single" w:color="CCCCCC" w:sz="1"/>
+              <w:right w:val="single" w:color="CCCCCC" w:sz="1"/>
+            </w:tcBorders>
+            <w:shd w:fill="FFFFFF" w:val="clear"/>
+            <w:tcMar>
+              <w:top w:type="dxa" w:w="80"/>
+              <w:left w:type="dxa" w:w="120"/>
+              <w:bottom w:type="dxa" w:w="80"/>
+              <w:right w:type="dxa" w:w="120"/>
+            </w:tcMar>
+          </w:tcPr>
+          <w:p>
+            <w:r>
+              <w:rPr>
+                <w:rFonts w:ascii="Arial" w:cs="Arial" w:eastAsia="Arial" w:hAnsi="Arial"/>
+                <w:sz w:val="18"/>
+                <w:szCs w:val="18"/>
+              </w:rPr>
+              <w:t xml:space="preserve">✅ Nav and carousel both use mounted guards + CSS-only visibility toggling</w:t>
             </w:r>
           </w:p>
         </w:tc>
@@ -1635,35 +1626,35 @@
                 <w:sz w:val="18"/>
                 <w:szCs w:val="18"/>
               </w:rPr>
-              <w:t xml:space="preserve">Fixed: nav overlay on tiles</w:t>
-            </w:r>
-          </w:p>
-        </w:tc>
-        <w:tc>
-          <w:tcPr>
-            <w:tcW w:type="dxa" w:w="6240"/>
-            <w:tcBorders>
-              <w:top w:val="single" w:color="CCCCCC" w:sz="1"/>
-              <w:left w:val="single" w:color="CCCCCC" w:sz="1"/>
-              <w:bottom w:val="single" w:color="CCCCCC" w:sz="1"/>
-              <w:right w:val="single" w:color="CCCCCC" w:sz="1"/>
-            </w:tcBorders>
-            <w:shd w:fill="F9F9F9" w:val="clear"/>
-            <w:tcMar>
-              <w:top w:type="dxa" w:w="80"/>
-              <w:left w:type="dxa" w:w="120"/>
-              <w:bottom w:type="dxa" w:w="80"/>
-              <w:right w:type="dxa" w:w="120"/>
-            </w:tcMar>
-          </w:tcPr>
-          <w:p>
-            <w:r>
-              <w:rPr>
-                <w:rFonts w:ascii="Arial" w:cs="Arial" w:eastAsia="Arial" w:hAnsi="Arial"/>
-                <w:sz w:val="18"/>
-                <w:szCs w:val="18"/>
-              </w:rPr>
-              <w:t xml:space="preserve">✅ page padding-top 160px desktop, 148px mobile</w:t>
+              <w:t xml:space="preserve">Tile padding</w:t>
+            </w:r>
+          </w:p>
+        </w:tc>
+        <w:tc>
+          <w:tcPr>
+            <w:tcW w:type="dxa" w:w="6240"/>
+            <w:tcBorders>
+              <w:top w:val="single" w:color="CCCCCC" w:sz="1"/>
+              <w:left w:val="single" w:color="CCCCCC" w:sz="1"/>
+              <w:bottom w:val="single" w:color="CCCCCC" w:sz="1"/>
+              <w:right w:val="single" w:color="CCCCCC" w:sz="1"/>
+            </w:tcBorders>
+            <w:shd w:fill="F9F9F9" w:val="clear"/>
+            <w:tcMar>
+              <w:top w:type="dxa" w:w="80"/>
+              <w:left w:type="dxa" w:w="120"/>
+              <w:bottom w:type="dxa" w:w="80"/>
+              <w:right w:type="dxa" w:w="120"/>
+            </w:tcMar>
+          </w:tcPr>
+          <w:p>
+            <w:r>
+              <w:rPr>
+                <w:rFonts w:ascii="Arial" w:cs="Arial" w:eastAsia="Arial" w:hAnsi="Arial"/>
+                <w:sz w:val="18"/>
+                <w:szCs w:val="18"/>
+              </w:rPr>
+              <w:t xml:space="preserve">✅ 32px horizontal gutters on bento grid</w:t>
             </w:r>
           </w:p>
         </w:tc>
@@ -1693,44 +1684,99 @@
                 <w:sz w:val="18"/>
                 <w:szCs w:val="18"/>
               </w:rPr>
-              <w:t xml:space="preserve">Logo size</w:t>
-            </w:r>
-          </w:p>
-        </w:tc>
-        <w:tc>
-          <w:tcPr>
-            <w:tcW w:type="dxa" w:w="6240"/>
-            <w:tcBorders>
-              <w:top w:val="single" w:color="CCCCCC" w:sz="1"/>
-              <w:left w:val="single" w:color="CCCCCC" w:sz="1"/>
-              <w:bottom w:val="single" w:color="CCCCCC" w:sz="1"/>
-              <w:right w:val="single" w:color="CCCCCC" w:sz="1"/>
-            </w:tcBorders>
-            <w:shd w:fill="FFFFFF" w:val="clear"/>
-            <w:tcMar>
-              <w:top w:type="dxa" w:w="80"/>
-              <w:left w:type="dxa" w:w="120"/>
-              <w:bottom w:type="dxa" w:w="80"/>
-              <w:right w:type="dxa" w:w="120"/>
-            </w:tcMar>
-          </w:tcPr>
-          <w:p>
-            <w:r>
-              <w:rPr>
-                <w:rFonts w:ascii="Arial" w:cs="Arial" w:eastAsia="Arial" w:hAnsi="Arial"/>
-                <w:sz w:val="18"/>
-                <w:szCs w:val="18"/>
-              </w:rPr>
-              <w:t xml:space="preserve">✅ 100px height locked in page.jsx</w:t>
+              <w:t xml:space="preserve">Era tile height</w:t>
+            </w:r>
+          </w:p>
+        </w:tc>
+        <w:tc>
+          <w:tcPr>
+            <w:tcW w:type="dxa" w:w="6240"/>
+            <w:tcBorders>
+              <w:top w:val="single" w:color="CCCCCC" w:sz="1"/>
+              <w:left w:val="single" w:color="CCCCCC" w:sz="1"/>
+              <w:bottom w:val="single" w:color="CCCCCC" w:sz="1"/>
+              <w:right w:val="single" w:color="CCCCCC" w:sz="1"/>
+            </w:tcBorders>
+            <w:shd w:fill="FFFFFF" w:val="clear"/>
+            <w:tcMar>
+              <w:top w:type="dxa" w:w="80"/>
+              <w:left w:type="dxa" w:w="120"/>
+              <w:bottom w:type="dxa" w:w="80"/>
+              <w:right w:type="dxa" w:w="120"/>
+            </w:tcMar>
+          </w:tcPr>
+          <w:p>
+            <w:r>
+              <w:rPr>
+                <w:rFonts w:ascii="Arial" w:cs="Arial" w:eastAsia="Arial" w:hAnsi="Arial"/>
+                <w:sz w:val="18"/>
+                <w:szCs w:val="18"/>
+              </w:rPr>
+              <w:t xml:space="preserve">✅ Reduced to 500px</w:t>
+            </w:r>
+          </w:p>
+        </w:tc>
+      </w:tr>
+      <w:tr>
+        <w:tc>
+          <w:tcPr>
+            <w:tcW w:type="dxa" w:w="3120"/>
+            <w:tcBorders>
+              <w:top w:val="single" w:color="CCCCCC" w:sz="1"/>
+              <w:left w:val="single" w:color="CCCCCC" w:sz="1"/>
+              <w:bottom w:val="single" w:color="CCCCCC" w:sz="1"/>
+              <w:right w:val="single" w:color="CCCCCC" w:sz="1"/>
+            </w:tcBorders>
+            <w:shd w:fill="F9F9F9" w:val="clear"/>
+            <w:tcMar>
+              <w:top w:type="dxa" w:w="80"/>
+              <w:left w:type="dxa" w:w="120"/>
+              <w:bottom w:type="dxa" w:w="80"/>
+              <w:right w:type="dxa" w:w="120"/>
+            </w:tcMar>
+          </w:tcPr>
+          <w:p>
+            <w:r>
+              <w:rPr>
+                <w:rFonts w:ascii="Arial" w:cs="Arial" w:eastAsia="Arial" w:hAnsi="Arial"/>
+                <w:sz w:val="18"/>
+                <w:szCs w:val="18"/>
+              </w:rPr>
+              <w:t xml:space="preserve">Carousel gutters</w:t>
+            </w:r>
+          </w:p>
+        </w:tc>
+        <w:tc>
+          <w:tcPr>
+            <w:tcW w:type="dxa" w:w="6240"/>
+            <w:tcBorders>
+              <w:top w:val="single" w:color="CCCCCC" w:sz="1"/>
+              <w:left w:val="single" w:color="CCCCCC" w:sz="1"/>
+              <w:bottom w:val="single" w:color="CCCCCC" w:sz="1"/>
+              <w:right w:val="single" w:color="CCCCCC" w:sz="1"/>
+            </w:tcBorders>
+            <w:shd w:fill="F9F9F9" w:val="clear"/>
+            <w:tcMar>
+              <w:top w:type="dxa" w:w="80"/>
+              <w:left w:type="dxa" w:w="120"/>
+              <w:bottom w:type="dxa" w:w="80"/>
+              <w:right w:type="dxa" w:w="120"/>
+            </w:tcMar>
+          </w:tcPr>
+          <w:p>
+            <w:r>
+              <w:rPr>
+                <w:rFonts w:ascii="Arial" w:cs="Arial" w:eastAsia="Arial" w:hAnsi="Arial"/>
+                <w:sz w:val="18"/>
+                <w:szCs w:val="18"/>
+              </w:rPr>
+              <w:t xml:space="preserve">✅ 220px each side for scroll access</w:t>
             </w:r>
           </w:p>
         </w:tc>
       </w:tr>
     </w:tbl>
     <w:p>
-      <w:pPr>
-        <w:spacing w:after="80" w:before="80"/>
-      </w:pPr>
       <w:r>
         <w:t xml:space="preserve"/>
       </w:r>
@@ -1748,13 +1794,10 @@
           <w:sz w:val="32"/>
           <w:szCs w:val="32"/>
         </w:rPr>
-        <w:t xml:space="preserve">✅ DONE MAY 4 — NINTH PASS</w:t>
-      </w:r>
-    </w:p>
-    <w:p>
-      <w:pPr>
-        <w:spacing w:after="80" w:before="80"/>
-      </w:pPr>
+        <w:t xml:space="preserve">✅ DONE MAY 6 — TENTH PASS</w:t>
+      </w:r>
+    </w:p>
+    <w:p>
       <w:r>
         <w:t xml:space="preserve"/>
       </w:r>
@@ -1867,35 +1910,35 @@
                 <w:sz w:val="18"/>
                 <w:szCs w:val="18"/>
               </w:rPr>
-              <w:t xml:space="preserve">OEM backfill — catalog_unified</w:t>
-            </w:r>
-          </w:p>
-        </w:tc>
-        <w:tc>
-          <w:tcPr>
-            <w:tcW w:type="dxa" w:w="6240"/>
-            <w:tcBorders>
-              <w:top w:val="single" w:color="CCCCCC" w:sz="1"/>
-              <w:left w:val="single" w:color="CCCCCC" w:sz="1"/>
-              <w:bottom w:val="single" w:color="CCCCCC" w:sz="1"/>
-              <w:right w:val="single" w:color="CCCCCC" w:sz="1"/>
-            </w:tcBorders>
-            <w:shd w:fill="F9F9F9" w:val="clear"/>
-            <w:tcMar>
-              <w:top w:type="dxa" w:w="80"/>
-              <w:left w:type="dxa" w:w="120"/>
-              <w:bottom w:type="dxa" w:w="80"/>
-              <w:right w:type="dxa" w:w="120"/>
-            </w:tcMar>
-          </w:tcPr>
-          <w:p>
-            <w:r>
-              <w:rPr>
-                <w:rFonts w:ascii="Arial" w:cs="Arial" w:eastAsia="Arial" w:hAnsi="Arial"/>
-                <w:sz w:val="18"/>
-                <w:szCs w:val="18"/>
-              </w:rPr>
-              <w:t xml:space="preserve">✅ 56,755 products now have oem_numbers (up from 36,692)</w:t>
+              <w:t xml:space="preserve">New bento homepage</w:t>
+            </w:r>
+          </w:p>
+        </w:tc>
+        <w:tc>
+          <w:tcPr>
+            <w:tcW w:type="dxa" w:w="6240"/>
+            <w:tcBorders>
+              <w:top w:val="single" w:color="CCCCCC" w:sz="1"/>
+              <w:left w:val="single" w:color="CCCCCC" w:sz="1"/>
+              <w:bottom w:val="single" w:color="CCCCCC" w:sz="1"/>
+              <w:right w:val="single" w:color="CCCCCC" w:sz="1"/>
+            </w:tcBorders>
+            <w:shd w:fill="F9F9F9" w:val="clear"/>
+            <w:tcMar>
+              <w:top w:type="dxa" w:w="80"/>
+              <w:left w:type="dxa" w:w="120"/>
+              <w:bottom w:type="dxa" w:w="80"/>
+              <w:right w:type="dxa" w:w="120"/>
+            </w:tcMar>
+          </w:tcPr>
+          <w:p>
+            <w:r>
+              <w:rPr>
+                <w:rFonts w:ascii="Arial" w:cs="Arial" w:eastAsia="Arial" w:hAnsi="Arial"/>
+                <w:sz w:val="18"/>
+                <w:szCs w:val="18"/>
+              </w:rPr>
+              <w:t xml:space="preserve">✅ app/page.jsx — dark animated bento grid</w:t>
             </w:r>
           </w:p>
         </w:tc>
@@ -1925,35 +1968,35 @@
                 <w:sz w:val="18"/>
                 <w:szCs w:val="18"/>
               </w:rPr>
-              <w:t xml:space="preserve">PU OEM coverage</w:t>
-            </w:r>
-          </w:p>
-        </w:tc>
-        <w:tc>
-          <w:tcPr>
-            <w:tcW w:type="dxa" w:w="6240"/>
-            <w:tcBorders>
-              <w:top w:val="single" w:color="CCCCCC" w:sz="1"/>
-              <w:left w:val="single" w:color="CCCCCC" w:sz="1"/>
-              <w:bottom w:val="single" w:color="CCCCCC" w:sz="1"/>
-              <w:right w:val="single" w:color="CCCCCC" w:sz="1"/>
-            </w:tcBorders>
-            <w:shd w:fill="FFFFFF" w:val="clear"/>
-            <w:tcMar>
-              <w:top w:type="dxa" w:w="80"/>
-              <w:left w:type="dxa" w:w="120"/>
-              <w:bottom w:type="dxa" w:w="80"/>
-              <w:right w:type="dxa" w:w="120"/>
-            </w:tcMar>
-          </w:tcPr>
-          <w:p>
-            <w:r>
-              <w:rPr>
-                <w:rFonts w:ascii="Arial" w:cs="Arial" w:eastAsia="Arial" w:hAnsi="Arial"/>
-                <w:sz w:val="18"/>
-                <w:szCs w:val="18"/>
-              </w:rPr>
-              <w:t xml:space="preserve">✅ 23,939 / 24,009 (99.7%)</w:t>
+              <w:t xml:space="preserve">Floating pill nav</w:t>
+            </w:r>
+          </w:p>
+        </w:tc>
+        <w:tc>
+          <w:tcPr>
+            <w:tcW w:type="dxa" w:w="6240"/>
+            <w:tcBorders>
+              <w:top w:val="single" w:color="CCCCCC" w:sz="1"/>
+              <w:left w:val="single" w:color="CCCCCC" w:sz="1"/>
+              <w:bottom w:val="single" w:color="CCCCCC" w:sz="1"/>
+              <w:right w:val="single" w:color="CCCCCC" w:sz="1"/>
+            </w:tcBorders>
+            <w:shd w:fill="FFFFFF" w:val="clear"/>
+            <w:tcMar>
+              <w:top w:type="dxa" w:w="80"/>
+              <w:left w:type="dxa" w:w="120"/>
+              <w:bottom w:type="dxa" w:w="80"/>
+              <w:right w:type="dxa" w:w="120"/>
+            </w:tcMar>
+          </w:tcPr>
+          <w:p>
+            <w:r>
+              <w:rPr>
+                <w:rFonts w:ascii="Arial" w:cs="Arial" w:eastAsia="Arial" w:hAnsi="Arial"/>
+                <w:sz w:val="18"/>
+                <w:szCs w:val="18"/>
+              </w:rPr>
+              <w:t xml:space="preserve">✅ Logo 100px, gold border on scroll, 160px page padding</w:t>
             </w:r>
           </w:p>
         </w:tc>
@@ -1983,35 +2026,35 @@
                 <w:sz w:val="18"/>
                 <w:szCs w:val="18"/>
               </w:rPr>
-              <w:t xml:space="preserve">VTWIN OEM coverage</w:t>
-            </w:r>
-          </w:p>
-        </w:tc>
-        <w:tc>
-          <w:tcPr>
-            <w:tcW w:type="dxa" w:w="6240"/>
-            <w:tcBorders>
-              <w:top w:val="single" w:color="CCCCCC" w:sz="1"/>
-              <w:left w:val="single" w:color="CCCCCC" w:sz="1"/>
-              <w:bottom w:val="single" w:color="CCCCCC" w:sz="1"/>
-              <w:right w:val="single" w:color="CCCCCC" w:sz="1"/>
-            </w:tcBorders>
-            <w:shd w:fill="F9F9F9" w:val="clear"/>
-            <w:tcMar>
-              <w:top w:type="dxa" w:w="80"/>
-              <w:left w:type="dxa" w:w="120"/>
-              <w:bottom w:type="dxa" w:w="80"/>
-              <w:right w:type="dxa" w:w="120"/>
-            </w:tcMar>
-          </w:tcPr>
-          <w:p>
-            <w:r>
-              <w:rPr>
-                <w:rFonts w:ascii="Arial" w:cs="Arial" w:eastAsia="Arial" w:hAnsi="Arial"/>
-                <w:sz w:val="18"/>
-                <w:szCs w:val="18"/>
-              </w:rPr>
-              <w:t xml:space="preserve">✅ 25,849 / 37,749 (68.5%)</w:t>
+              <w:t xml:space="preserve">Year→Model search</w:t>
+            </w:r>
+          </w:p>
+        </w:tc>
+        <w:tc>
+          <w:tcPr>
+            <w:tcW w:type="dxa" w:w="6240"/>
+            <w:tcBorders>
+              <w:top w:val="single" w:color="CCCCCC" w:sz="1"/>
+              <w:left w:val="single" w:color="CCCCCC" w:sz="1"/>
+              <w:bottom w:val="single" w:color="CCCCCC" w:sz="1"/>
+              <w:right w:val="single" w:color="CCCCCC" w:sz="1"/>
+            </w:tcBorders>
+            <w:shd w:fill="F9F9F9" w:val="clear"/>
+            <w:tcMar>
+              <w:top w:type="dxa" w:w="80"/>
+              <w:left w:type="dxa" w:w="120"/>
+              <w:bottom w:type="dxa" w:w="80"/>
+              <w:right w:type="dxa" w:w="120"/>
+            </w:tcMar>
+          </w:tcPr>
+          <w:p>
+            <w:r>
+              <w:rPr>
+                <w:rFonts w:ascii="Arial" w:cs="Arial" w:eastAsia="Arial" w:hAnsi="Arial"/>
+                <w:sz w:val="18"/>
+                <w:szCs w:val="18"/>
+              </w:rPr>
+              <w:t xml:space="preserve">✅ Year dropdown → createPortal modal → /browse route</w:t>
             </w:r>
           </w:p>
         </w:tc>
@@ -2041,35 +2084,35 @@
                 <w:sz w:val="18"/>
                 <w:szCs w:val="18"/>
               </w:rPr>
-              <w:t xml:space="preserve">WPS OEM coverage</w:t>
-            </w:r>
-          </w:p>
-        </w:tc>
-        <w:tc>
-          <w:tcPr>
-            <w:tcW w:type="dxa" w:w="6240"/>
-            <w:tcBorders>
-              <w:top w:val="single" w:color="CCCCCC" w:sz="1"/>
-              <w:left w:val="single" w:color="CCCCCC" w:sz="1"/>
-              <w:bottom w:val="single" w:color="CCCCCC" w:sz="1"/>
-              <w:right w:val="single" w:color="CCCCCC" w:sz="1"/>
-            </w:tcBorders>
-            <w:shd w:fill="FFFFFF" w:val="clear"/>
-            <w:tcMar>
-              <w:top w:type="dxa" w:w="80"/>
-              <w:left w:type="dxa" w:w="120"/>
-              <w:bottom w:type="dxa" w:w="80"/>
-              <w:right w:type="dxa" w:w="120"/>
-            </w:tcMar>
-          </w:tcPr>
-          <w:p>
-            <w:r>
-              <w:rPr>
-                <w:rFonts w:ascii="Arial" w:cs="Arial" w:eastAsia="Arial" w:hAnsi="Arial"/>
-                <w:sz w:val="18"/>
-                <w:szCs w:val="18"/>
-              </w:rPr>
-              <w:t xml:space="preserve">✅ 6,967 / 26,754 (26%)</w:t>
+              <w:t xml:space="preserve">Model search API</w:t>
+            </w:r>
+          </w:p>
+        </w:tc>
+        <w:tc>
+          <w:tcPr>
+            <w:tcW w:type="dxa" w:w="6240"/>
+            <w:tcBorders>
+              <w:top w:val="single" w:color="CCCCCC" w:sz="1"/>
+              <w:left w:val="single" w:color="CCCCCC" w:sz="1"/>
+              <w:bottom w:val="single" w:color="CCCCCC" w:sz="1"/>
+              <w:right w:val="single" w:color="CCCCCC" w:sz="1"/>
+            </w:tcBorders>
+            <w:shd w:fill="FFFFFF" w:val="clear"/>
+            <w:tcMar>
+              <w:top w:type="dxa" w:w="80"/>
+              <w:left w:type="dxa" w:w="120"/>
+              <w:bottom w:type="dxa" w:w="80"/>
+              <w:right w:type="dxa" w:w="120"/>
+            </w:tcMar>
+          </w:tcPr>
+          <w:p>
+            <w:r>
+              <w:rPr>
+                <w:rFonts w:ascii="Arial" w:cs="Arial" w:eastAsia="Arial" w:hAnsi="Arial"/>
+                <w:sz w:val="18"/>
+                <w:szCs w:val="18"/>
+              </w:rPr>
+              <w:t xml:space="preserve">✅ /api/models/search live — hd_year_model_master, IPv4 pg Pool</w:t>
             </w:r>
           </w:p>
         </w:tc>
@@ -2099,35 +2142,35 @@
                 <w:sz w:val="18"/>
                 <w:szCs w:val="18"/>
               </w:rPr>
-              <w:t xml:space="preserve">pdp_payload backfill</w:t>
-            </w:r>
-          </w:p>
-        </w:tc>
-        <w:tc>
-          <w:tcPr>
-            <w:tcW w:type="dxa" w:w="6240"/>
-            <w:tcBorders>
-              <w:top w:val="single" w:color="CCCCCC" w:sz="1"/>
-              <w:left w:val="single" w:color="CCCCCC" w:sz="1"/>
-              <w:bottom w:val="single" w:color="CCCCCC" w:sz="1"/>
-              <w:right w:val="single" w:color="CCCCCC" w:sz="1"/>
-            </w:tcBorders>
-            <w:shd w:fill="F9F9F9" w:val="clear"/>
-            <w:tcMar>
-              <w:top w:type="dxa" w:w="80"/>
-              <w:left w:type="dxa" w:w="120"/>
-              <w:bottom w:type="dxa" w:w="80"/>
-              <w:right w:type="dxa" w:w="120"/>
-            </w:tcMar>
-          </w:tcPr>
-          <w:p>
-            <w:r>
-              <w:rPr>
-                <w:rFonts w:ascii="Arial" w:cs="Arial" w:eastAsia="Arial" w:hAnsi="Arial"/>
-                <w:sz w:val="18"/>
-                <w:szCs w:val="18"/>
-              </w:rPr>
-              <w:t xml:space="preserve">✅ 88,512 rows — all products</w:t>
+              <w:t xml:space="preserve">Era horizontal slider</w:t>
+            </w:r>
+          </w:p>
+        </w:tc>
+        <w:tc>
+          <w:tcPr>
+            <w:tcW w:type="dxa" w:w="6240"/>
+            <w:tcBorders>
+              <w:top w:val="single" w:color="CCCCCC" w:sz="1"/>
+              <w:left w:val="single" w:color="CCCCCC" w:sz="1"/>
+              <w:bottom w:val="single" w:color="CCCCCC" w:sz="1"/>
+              <w:right w:val="single" w:color="CCCCCC" w:sz="1"/>
+            </w:tcBorders>
+            <w:shd w:fill="F9F9F9" w:val="clear"/>
+            <w:tcMar>
+              <w:top w:type="dxa" w:w="80"/>
+              <w:left w:type="dxa" w:w="120"/>
+              <w:bottom w:type="dxa" w:w="80"/>
+              <w:right w:type="dxa" w:w="120"/>
+            </w:tcMar>
+          </w:tcPr>
+          <w:p>
+            <w:r>
+              <w:rPr>
+                <w:rFonts w:ascii="Arial" w:cs="Arial" w:eastAsia="Arial" w:hAnsi="Arial"/>
+                <w:sz w:val="18"/>
+                <w:szCs w:val="18"/>
+              </w:rPr>
+              <w:t xml:space="preserve">✅ Replaced in this session with 3D carousel</w:t>
             </w:r>
           </w:p>
         </w:tc>
@@ -2157,35 +2200,35 @@
                 <w:sz w:val="18"/>
                 <w:szCs w:val="18"/>
               </w:rPr>
-              <w:t xml:space="preserve">Typesense index rebuild</w:t>
-            </w:r>
-          </w:p>
-        </w:tc>
-        <w:tc>
-          <w:tcPr>
-            <w:tcW w:type="dxa" w:w="6240"/>
-            <w:tcBorders>
-              <w:top w:val="single" w:color="CCCCCC" w:sz="1"/>
-              <w:left w:val="single" w:color="CCCCCC" w:sz="1"/>
-              <w:bottom w:val="single" w:color="CCCCCC" w:sz="1"/>
-              <w:right w:val="single" w:color="CCCCCC" w:sz="1"/>
-            </w:tcBorders>
-            <w:shd w:fill="FFFFFF" w:val="clear"/>
-            <w:tcMar>
-              <w:top w:type="dxa" w:w="80"/>
-              <w:left w:type="dxa" w:w="120"/>
-              <w:bottom w:type="dxa" w:w="80"/>
-              <w:right w:type="dxa" w:w="120"/>
-            </w:tcMar>
-          </w:tcPr>
-          <w:p>
-            <w:r>
-              <w:rPr>
-                <w:rFonts w:ascii="Arial" w:cs="Arial" w:eastAsia="Arial" w:hAnsi="Arial"/>
-                <w:sz w:val="18"/>
-                <w:szCs w:val="18"/>
-              </w:rPr>
-              <w:t xml:space="preserve">✅ oem_numbers[] added to schema + query_by</w:t>
+              <w:t xml:space="preserve">Fixed: next/image error</w:t>
+            </w:r>
+          </w:p>
+        </w:tc>
+        <w:tc>
+          <w:tcPr>
+            <w:tcW w:type="dxa" w:w="6240"/>
+            <w:tcBorders>
+              <w:top w:val="single" w:color="CCCCCC" w:sz="1"/>
+              <w:left w:val="single" w:color="CCCCCC" w:sz="1"/>
+              <w:bottom w:val="single" w:color="CCCCCC" w:sz="1"/>
+              <w:right w:val="single" w:color="CCCCCC" w:sz="1"/>
+            </w:tcBorders>
+            <w:shd w:fill="FFFFFF" w:val="clear"/>
+            <w:tcMar>
+              <w:top w:type="dxa" w:w="80"/>
+              <w:left w:type="dxa" w:w="120"/>
+              <w:bottom w:type="dxa" w:w="80"/>
+              <w:right w:type="dxa" w:w="120"/>
+            </w:tcMar>
+          </w:tcPr>
+          <w:p>
+            <w:r>
+              <w:rPr>
+                <w:rFonts w:ascii="Arial" w:cs="Arial" w:eastAsia="Arial" w:hAnsi="Arial"/>
+                <w:sz w:val="18"/>
+                <w:szCs w:val="18"/>
+              </w:rPr>
+              <w:t xml:space="preserve">✅ Plain &lt;img&gt; tag</w:t>
             </w:r>
           </w:p>
         </w:tc>
@@ -2215,35 +2258,35 @@
                 <w:sz w:val="18"/>
                 <w:szCs w:val="18"/>
               </w:rPr>
-              <w:t xml:space="preserve">browse.ts search bug fix</w:t>
-            </w:r>
-          </w:p>
-        </w:tc>
-        <w:tc>
-          <w:tcPr>
-            <w:tcW w:type="dxa" w:w="6240"/>
-            <w:tcBorders>
-              <w:top w:val="single" w:color="CCCCCC" w:sz="1"/>
-              <w:left w:val="single" w:color="CCCCCC" w:sz="1"/>
-              <w:bottom w:val="single" w:color="CCCCCC" w:sz="1"/>
-              <w:right w:val="single" w:color="CCCCCC" w:sz="1"/>
-            </w:tcBorders>
-            <w:shd w:fill="F9F9F9" w:val="clear"/>
-            <w:tcMar>
-              <w:top w:type="dxa" w:w="80"/>
-              <w:left w:type="dxa" w:w="120"/>
-              <w:bottom w:type="dxa" w:w="80"/>
-              <w:right w:type="dxa" w:w="120"/>
-            </w:tcMar>
-          </w:tcPr>
-          <w:p>
-            <w:r>
-              <w:rPr>
-                <w:rFonts w:ascii="Arial" w:cs="Arial" w:eastAsia="Arial" w:hAnsi="Arial"/>
-                <w:sz w:val="18"/>
-                <w:szCs w:val="18"/>
-              </w:rPr>
-              <w:t xml:space="preserve">✅ Broken $p counter + missing ::text cast on oem_numbers</w:t>
+              <w:t xml:space="preserve">Fixed: IPv6 pg Pool</w:t>
+            </w:r>
+          </w:p>
+        </w:tc>
+        <w:tc>
+          <w:tcPr>
+            <w:tcW w:type="dxa" w:w="6240"/>
+            <w:tcBorders>
+              <w:top w:val="single" w:color="CCCCCC" w:sz="1"/>
+              <w:left w:val="single" w:color="CCCCCC" w:sz="1"/>
+              <w:bottom w:val="single" w:color="CCCCCC" w:sz="1"/>
+              <w:right w:val="single" w:color="CCCCCC" w:sz="1"/>
+            </w:tcBorders>
+            <w:shd w:fill="F9F9F9" w:val="clear"/>
+            <w:tcMar>
+              <w:top w:type="dxa" w:w="80"/>
+              <w:left w:type="dxa" w:w="120"/>
+              <w:bottom w:type="dxa" w:w="80"/>
+              <w:right w:type="dxa" w:w="120"/>
+            </w:tcMar>
+          </w:tcPr>
+          <w:p>
+            <w:r>
+              <w:rPr>
+                <w:rFonts w:ascii="Arial" w:cs="Arial" w:eastAsia="Arial" w:hAnsi="Arial"/>
+                <w:sz w:val="18"/>
+                <w:szCs w:val="18"/>
+              </w:rPr>
+              <w:t xml:space="preserve">✅ host/port/db params</w:t>
             </w:r>
           </w:p>
         </w:tc>
@@ -2273,35 +2316,35 @@
                 <w:sz w:val="18"/>
                 <w:szCs w:val="18"/>
               </w:rPr>
-              <w:t xml:space="preserve">GlobalSearch redesign</w:t>
-            </w:r>
-          </w:p>
-        </w:tc>
-        <w:tc>
-          <w:tcPr>
-            <w:tcW w:type="dxa" w:w="6240"/>
-            <w:tcBorders>
-              <w:top w:val="single" w:color="CCCCCC" w:sz="1"/>
-              <w:left w:val="single" w:color="CCCCCC" w:sz="1"/>
-              <w:bottom w:val="single" w:color="CCCCCC" w:sz="1"/>
-              <w:right w:val="single" w:color="CCCCCC" w:sz="1"/>
-            </w:tcBorders>
-            <w:shd w:fill="FFFFFF" w:val="clear"/>
-            <w:tcMar>
-              <w:top w:type="dxa" w:w="80"/>
-              <w:left w:type="dxa" w:w="120"/>
-              <w:bottom w:type="dxa" w:w="80"/>
-              <w:right w:type="dxa" w:w="120"/>
-            </w:tcMar>
-          </w:tcPr>
-          <w:p>
-            <w:r>
-              <w:rPr>
-                <w:rFonts w:ascii="Arial" w:cs="Arial" w:eastAsia="Arial" w:hAnsi="Arial"/>
-                <w:sz w:val="18"/>
-                <w:szCs w:val="18"/>
-              </w:rPr>
-              <w:t xml:space="preserve">✅ Compact nav search with gold cloud backdrop</w:t>
+              <w:t xml:space="preserve">Fixed: modal clipping</w:t>
+            </w:r>
+          </w:p>
+        </w:tc>
+        <w:tc>
+          <w:tcPr>
+            <w:tcW w:type="dxa" w:w="6240"/>
+            <w:tcBorders>
+              <w:top w:val="single" w:color="CCCCCC" w:sz="1"/>
+              <w:left w:val="single" w:color="CCCCCC" w:sz="1"/>
+              <w:bottom w:val="single" w:color="CCCCCC" w:sz="1"/>
+              <w:right w:val="single" w:color="CCCCCC" w:sz="1"/>
+            </w:tcBorders>
+            <w:shd w:fill="FFFFFF" w:val="clear"/>
+            <w:tcMar>
+              <w:top w:type="dxa" w:w="80"/>
+              <w:left w:type="dxa" w:w="120"/>
+              <w:bottom w:type="dxa" w:w="80"/>
+              <w:right w:type="dxa" w:w="120"/>
+            </w:tcMar>
+          </w:tcPr>
+          <w:p>
+            <w:r>
+              <w:rPr>
+                <w:rFonts w:ascii="Arial" w:cs="Arial" w:eastAsia="Arial" w:hAnsi="Arial"/>
+                <w:sz w:val="18"/>
+                <w:szCs w:val="18"/>
+              </w:rPr>
+              <w:t xml:space="preserve">✅ createPortal to document.body</w:t>
             </w:r>
           </w:p>
         </w:tc>
@@ -2331,218 +2374,41 @@
                 <w:sz w:val="18"/>
                 <w:szCs w:val="18"/>
               </w:rPr>
-              <w:t xml:space="preserve">SideNav panel</w:t>
-            </w:r>
-          </w:p>
-        </w:tc>
-        <w:tc>
-          <w:tcPr>
-            <w:tcW w:type="dxa" w:w="6240"/>
-            <w:tcBorders>
-              <w:top w:val="single" w:color="CCCCCC" w:sz="1"/>
-              <w:left w:val="single" w:color="CCCCCC" w:sz="1"/>
-              <w:bottom w:val="single" w:color="CCCCCC" w:sz="1"/>
-              <w:right w:val="single" w:color="CCCCCC" w:sz="1"/>
-            </w:tcBorders>
-            <w:shd w:fill="F9F9F9" w:val="clear"/>
-            <w:tcMar>
-              <w:top w:type="dxa" w:w="80"/>
-              <w:left w:type="dxa" w:w="120"/>
-              <w:bottom w:type="dxa" w:w="80"/>
-              <w:right w:type="dxa" w:w="120"/>
-            </w:tcMar>
-          </w:tcPr>
-          <w:p>
-            <w:r>
-              <w:rPr>
-                <w:rFonts w:ascii="Arial" w:cs="Arial" w:eastAsia="Arial" w:hAnsi="Arial"/>
-                <w:sz w:val="18"/>
-                <w:szCs w:val="18"/>
-              </w:rPr>
-              <w:t xml:space="preserve">✅ Logo trigger, 6 nav items, spring animation</w:t>
-            </w:r>
-          </w:p>
-        </w:tc>
-      </w:tr>
-      <w:tr>
-        <w:tc>
-          <w:tcPr>
-            <w:tcW w:type="dxa" w:w="3120"/>
-            <w:tcBorders>
-              <w:top w:val="single" w:color="CCCCCC" w:sz="1"/>
-              <w:left w:val="single" w:color="CCCCCC" w:sz="1"/>
-              <w:bottom w:val="single" w:color="CCCCCC" w:sz="1"/>
-              <w:right w:val="single" w:color="CCCCCC" w:sz="1"/>
-            </w:tcBorders>
-            <w:shd w:fill="FFFFFF" w:val="clear"/>
-            <w:tcMar>
-              <w:top w:type="dxa" w:w="80"/>
-              <w:left w:type="dxa" w:w="120"/>
-              <w:bottom w:type="dxa" w:w="80"/>
-              <w:right w:type="dxa" w:w="120"/>
-            </w:tcMar>
-          </w:tcPr>
-          <w:p>
-            <w:r>
-              <w:rPr>
-                <w:rFonts w:ascii="Arial" w:cs="Arial" w:eastAsia="Arial" w:hAnsi="Arial"/>
-                <w:sz w:val="18"/>
-                <w:szCs w:val="18"/>
-              </w:rPr>
-              <w:t xml:space="preserve">Era card gold borders</w:t>
-            </w:r>
-          </w:p>
-        </w:tc>
-        <w:tc>
-          <w:tcPr>
-            <w:tcW w:type="dxa" w:w="6240"/>
-            <w:tcBorders>
-              <w:top w:val="single" w:color="CCCCCC" w:sz="1"/>
-              <w:left w:val="single" w:color="CCCCCC" w:sz="1"/>
-              <w:bottom w:val="single" w:color="CCCCCC" w:sz="1"/>
-              <w:right w:val="single" w:color="CCCCCC" w:sz="1"/>
-            </w:tcBorders>
-            <w:shd w:fill="FFFFFF" w:val="clear"/>
-            <w:tcMar>
-              <w:top w:type="dxa" w:w="80"/>
-              <w:left w:type="dxa" w:w="120"/>
-              <w:bottom w:type="dxa" w:w="80"/>
-              <w:right w:type="dxa" w:w="120"/>
-            </w:tcMar>
-          </w:tcPr>
-          <w:p>
-            <w:r>
-              <w:rPr>
-                <w:rFonts w:ascii="Arial" w:cs="Arial" w:eastAsia="Arial" w:hAnsi="Arial"/>
-                <w:sz w:val="18"/>
-                <w:szCs w:val="18"/>
-              </w:rPr>
-              <w:t xml:space="preserve">✅ outline trick to render above background images</w:t>
-            </w:r>
-          </w:p>
-        </w:tc>
-      </w:tr>
-      <w:tr>
-        <w:tc>
-          <w:tcPr>
-            <w:tcW w:type="dxa" w:w="3120"/>
-            <w:tcBorders>
-              <w:top w:val="single" w:color="CCCCCC" w:sz="1"/>
-              <w:left w:val="single" w:color="CCCCCC" w:sz="1"/>
-              <w:bottom w:val="single" w:color="CCCCCC" w:sz="1"/>
-              <w:right w:val="single" w:color="CCCCCC" w:sz="1"/>
-            </w:tcBorders>
-            <w:shd w:fill="F9F9F9" w:val="clear"/>
-            <w:tcMar>
-              <w:top w:type="dxa" w:w="80"/>
-              <w:left w:type="dxa" w:w="120"/>
-              <w:bottom w:type="dxa" w:w="80"/>
-              <w:right w:type="dxa" w:w="120"/>
-            </w:tcMar>
-          </w:tcPr>
-          <w:p>
-            <w:r>
-              <w:rPr>
-                <w:rFonts w:ascii="Arial" w:cs="Arial" w:eastAsia="Arial" w:hAnsi="Arial"/>
-                <w:sz w:val="18"/>
-                <w:szCs w:val="18"/>
-              </w:rPr>
-              <w:t xml:space="preserve">Teal header removed</w:t>
-            </w:r>
-          </w:p>
-        </w:tc>
-        <w:tc>
-          <w:tcPr>
-            <w:tcW w:type="dxa" w:w="6240"/>
-            <w:tcBorders>
-              <w:top w:val="single" w:color="CCCCCC" w:sz="1"/>
-              <w:left w:val="single" w:color="CCCCCC" w:sz="1"/>
-              <w:bottom w:val="single" w:color="CCCCCC" w:sz="1"/>
-              <w:right w:val="single" w:color="CCCCCC" w:sz="1"/>
-            </w:tcBorders>
-            <w:shd w:fill="F9F9F9" w:val="clear"/>
-            <w:tcMar>
-              <w:top w:type="dxa" w:w="80"/>
-              <w:left w:type="dxa" w:w="120"/>
-              <w:bottom w:type="dxa" w:w="80"/>
-              <w:right w:type="dxa" w:w="120"/>
-            </w:tcMar>
-          </w:tcPr>
-          <w:p>
-            <w:r>
-              <w:rPr>
-                <w:rFonts w:ascii="Arial" w:cs="Arial" w:eastAsia="Arial" w:hAnsi="Arial"/>
-                <w:sz w:val="18"/>
-                <w:szCs w:val="18"/>
-              </w:rPr>
-              <w:t xml:space="preserve">✅ Fixed to solid dark</w:t>
-            </w:r>
-          </w:p>
-        </w:tc>
-      </w:tr>
-      <w:tr>
-        <w:tc>
-          <w:tcPr>
-            <w:tcW w:type="dxa" w:w="3120"/>
-            <w:tcBorders>
-              <w:top w:val="single" w:color="CCCCCC" w:sz="1"/>
-              <w:left w:val="single" w:color="CCCCCC" w:sz="1"/>
-              <w:bottom w:val="single" w:color="CCCCCC" w:sz="1"/>
-              <w:right w:val="single" w:color="CCCCCC" w:sz="1"/>
-            </w:tcBorders>
-            <w:shd w:fill="FFFFFF" w:val="clear"/>
-            <w:tcMar>
-              <w:top w:type="dxa" w:w="80"/>
-              <w:left w:type="dxa" w:w="120"/>
-              <w:bottom w:type="dxa" w:w="80"/>
-              <w:right w:type="dxa" w:w="120"/>
-            </w:tcMar>
-          </w:tcPr>
-          <w:p>
-            <w:r>
-              <w:rPr>
-                <w:rFonts w:ascii="Arial" w:cs="Arial" w:eastAsia="Arial" w:hAnsi="Arial"/>
-                <w:sz w:val="18"/>
-                <w:szCs w:val="18"/>
-              </w:rPr>
-              <w:t xml:space="preserve">Logo in header</w:t>
-            </w:r>
-          </w:p>
-        </w:tc>
-        <w:tc>
-          <w:tcPr>
-            <w:tcW w:type="dxa" w:w="6240"/>
-            <w:tcBorders>
-              <w:top w:val="single" w:color="CCCCCC" w:sz="1"/>
-              <w:left w:val="single" w:color="CCCCCC" w:sz="1"/>
-              <w:bottom w:val="single" w:color="CCCCCC" w:sz="1"/>
-              <w:right w:val="single" w:color="CCCCCC" w:sz="1"/>
-            </w:tcBorders>
-            <w:shd w:fill="FFFFFF" w:val="clear"/>
-            <w:tcMar>
-              <w:top w:type="dxa" w:w="80"/>
-              <w:left w:type="dxa" w:w="120"/>
-              <w:bottom w:type="dxa" w:w="80"/>
-              <w:right w:type="dxa" w:w="120"/>
-            </w:tcMar>
-          </w:tcPr>
-          <w:p>
-            <w:r>
-              <w:rPr>
-                <w:rFonts w:ascii="Arial" w:cs="Arial" w:eastAsia="Arial" w:hAnsi="Arial"/>
-                <w:sz w:val="18"/>
-                <w:szCs w:val="18"/>
-              </w:rPr>
-              <w:t xml:space="preserve">✅ Logo image replacing text, right-aligned</w:t>
+              <w:t xml:space="preserve">Fixed: nav overlay</w:t>
+            </w:r>
+          </w:p>
+        </w:tc>
+        <w:tc>
+          <w:tcPr>
+            <w:tcW w:type="dxa" w:w="6240"/>
+            <w:tcBorders>
+              <w:top w:val="single" w:color="CCCCCC" w:sz="1"/>
+              <w:left w:val="single" w:color="CCCCCC" w:sz="1"/>
+              <w:bottom w:val="single" w:color="CCCCCC" w:sz="1"/>
+              <w:right w:val="single" w:color="CCCCCC" w:sz="1"/>
+            </w:tcBorders>
+            <w:shd w:fill="F9F9F9" w:val="clear"/>
+            <w:tcMar>
+              <w:top w:type="dxa" w:w="80"/>
+              <w:left w:type="dxa" w:w="120"/>
+              <w:bottom w:type="dxa" w:w="80"/>
+              <w:right w:type="dxa" w:w="120"/>
+            </w:tcMar>
+          </w:tcPr>
+          <w:p>
+            <w:r>
+              <w:rPr>
+                <w:rFonts w:ascii="Arial" w:cs="Arial" w:eastAsia="Arial" w:hAnsi="Arial"/>
+                <w:sz w:val="18"/>
+                <w:szCs w:val="18"/>
+              </w:rPr>
+              <w:t xml:space="preserve">✅ 160px padding-top</w:t>
             </w:r>
           </w:p>
         </w:tc>
       </w:tr>
     </w:tbl>
     <w:p>
-      <w:pPr>
-        <w:spacing w:after="80" w:before="80"/>
-      </w:pPr>
       <w:r>
         <w:t xml:space="preserve"/>
       </w:r>
@@ -2578,7 +2444,7 @@
           <w:sz w:val="20"/>
           <w:szCs w:val="20"/>
         </w:rPr>
-        <w:t xml:space="preserve">WPS Fitment Files — pending from rep. Explicit fitment → catalog_fitment_v2 directly.</w:t>
+        <w:t xml:space="preserve">WPS Fitment Files — pending from rep. Explicit fitment → catalog_fitment_v2.</w:t>
       </w:r>
     </w:p>
     <w:p>
@@ -2596,7 +2462,7 @@
           <w:sz w:val="20"/>
           <w:szCs w:val="20"/>
         </w:rPr>
-        <w:t xml:space="preserve">Better Touring + FX PDFs — text-based versions of scanned catalogs</w:t>
+        <w:t xml:space="preserve">VTwin OEM Cross-Reference ingest — PDF in hand, pipeline to build.</w:t>
       </w:r>
     </w:p>
     <w:p>
@@ -2614,7 +2480,7 @@
           <w:sz w:val="20"/>
           <w:szCs w:val="20"/>
         </w:rPr>
-        <w:t xml:space="preserve">VTwin OEM Cross-Reference ingest — PDF in hand, pipeline to build</w:t>
+        <w:t xml:space="preserve">Tile artwork — design at 1120×700px (16:10), drop in public/images/eras/.</w:t>
       </w:r>
     </w:p>
     <w:p>
@@ -2632,13 +2498,10 @@
           <w:sz w:val="20"/>
           <w:szCs w:val="20"/>
         </w:rPr>
-        <w:t xml:space="preserve">Tile artwork — Laken designing, wire in when SVGs ready</w:t>
-      </w:r>
-    </w:p>
-    <w:p>
-      <w:pPr>
-        <w:spacing w:after="80" w:before="80"/>
-      </w:pPr>
+        <w:t xml:space="preserve">Smoke background — verify visible on production after deploy.</w:t>
+      </w:r>
+    </w:p>
+    <w:p>
       <w:r>
         <w:t xml:space="preserve"/>
       </w:r>
@@ -2692,7 +2555,7 @@
           <w:sz w:val="20"/>
           <w:szCs w:val="20"/>
         </w:rPr>
-        <w:t xml:space="preserve">OEM match rate — 33.6% matched (41,874/124,796). Review by section for high-value gaps</w:t>
+        <w:t xml:space="preserve">OEM match rate — 33.6% matched. Review by section for high-value gaps</w:t>
       </w:r>
     </w:p>
     <w:p>
@@ -2818,7 +2681,61 @@
           <w:sz w:val="20"/>
           <w:szCs w:val="20"/>
         </w:rPr>
-        <w:t xml:space="preserve">model_alias_map — seed remaining: Road King, Street Glide, Sportster 1200, Fat Boy, Night Train, Dyna Wide Glide, era nicknames</w:t>
+        <w:t xml:space="preserve">model_alias_map — seed remaining: Road King, Street Glide, Fat Boy, Night Train, era nicknames</w:t>
+      </w:r>
+    </w:p>
+    <w:p>
+      <w:pPr>
+        <w:pStyle w:val="ListParagraph"/>
+        <w:numPr>
+          <w:ilvl w:val="0"/>
+          <w:numId w:val="2"/>
+        </w:numPr>
+        <w:spacing w:after="40" w:before="40"/>
+      </w:pPr>
+      <w:r>
+        <w:rPr>
+          <w:rFonts w:ascii="Arial" w:cs="Arial" w:eastAsia="Arial" w:hAnsi="Arial"/>
+          <w:sz w:val="20"/>
+          <w:szCs w:val="20"/>
+        </w:rPr>
+        <w:t xml:space="preserve">Video tile — placeholder, needs brand reel asset</w:t>
+      </w:r>
+    </w:p>
+    <w:p>
+      <w:pPr>
+        <w:pStyle w:val="ListParagraph"/>
+        <w:numPr>
+          <w:ilvl w:val="0"/>
+          <w:numId w:val="2"/>
+        </w:numPr>
+        <w:spacing w:after="40" w:before="40"/>
+      </w:pPr>
+      <w:r>
+        <w:rPr>
+          <w:rFonts w:ascii="Arial" w:cs="Arial" w:eastAsia="Arial" w:hAnsi="Arial"/>
+          <w:sz w:val="20"/>
+          <w:szCs w:val="20"/>
+        </w:rPr>
+        <w:t xml:space="preserve">Category tile — placeholder, needs category browsing UI</w:t>
+      </w:r>
+    </w:p>
+    <w:p>
+      <w:pPr>
+        <w:pStyle w:val="ListParagraph"/>
+        <w:numPr>
+          <w:ilvl w:val="0"/>
+          <w:numId w:val="2"/>
+        </w:numPr>
+        <w:spacing w:after="40" w:before="40"/>
+      </w:pPr>
+      <w:r>
+        <w:rPr>
+          <w:rFonts w:ascii="Arial" w:cs="Arial" w:eastAsia="Arial" w:hAnsi="Arial"/>
+          <w:sz w:val="20"/>
+          <w:szCs w:val="20"/>
+        </w:rPr>
+        <w:t xml:space="preserve">Deals tile — placeholder, needs live sale-flagged product pull</w:t>
       </w:r>
     </w:p>
     <w:sectPr>
@@ -3001,6 +2918,18 @@
       <w:start w:val="1"/>
       <w:numFmt w:val="bullet"/>
       <w:lvlText w:val="•"/>
+      <w:lvlJc w:val="left"/>
+      <w:pPr>
+        <w:ind w:left="720" w:hanging="360"/>
+      </w:pPr>
+    </w:lvl>
+  </w:abstractNum>
+  <w:abstractNum w:abstractNumId="3" w15:restartNumberingAfterBreak="0">
+    <w:multiLevelType w:val="hybridMultilevel"/>
+    <w:lvl w:ilvl="0" w15:tentative="1">
+      <w:start w:val="1"/>
+      <w:numFmt w:val="decimal"/>
+      <w:lvlText w:val="%1."/>
       <w:lvlJc w:val="left"/>
       <w:pPr>
         <w:ind w:left="720" w:hanging="360"/>

</xml_diff>

<commit_message>
feat: update Handoff Log and Master Reference with latest metrics and fitment data
- Updated HANDOFF_LOG.md to reflect the latest session progress, including the addition of a new AdminEditPanel component for product management.
- Enhanced MasterRef.md with updated catalog metrics, fitment coverage, and new model codes added to the database.
- Improved API route for admin product updates, ensuring better token handling for authorization.
- Added new fitment data from the VTwin scraper import, increasing product count and coverage.
</commit_message>
<xml_diff>
--- a/CHASE_LIST.docx
+++ b/CHASE_LIST.docx
@@ -32,7 +32,7 @@
           <w:sz w:val="20"/>
           <w:szCs w:val="20"/>
         </w:rPr>
-        <w:t xml:space="preserve">Last Updated: June 3, 2026 — Thirty-Seventh Pass</w:t>
+        <w:t xml:space="preserve">Last Updated: June 4, 2026 — Thirty-Eighth Pass</w:t>
       </w:r>
     </w:p>
     <w:p>
@@ -422,37 +422,37 @@
                 <w:sz w:val="18"/>
                 <w:szCs w:val="18"/>
               </w:rPr>
-              <w:t xml:space="preserve">Import vtwin_fitment.csv</w:t>
-            </w:r>
-          </w:p>
-        </w:tc>
-        <w:tc>
-          <w:tcPr>
-            <w:tcBorders>
-              <w:top w:val="single" w:color="CCCCCC" w:sz="1"/>
-              <w:left w:val="single" w:color="CCCCCC" w:sz="1"/>
-              <w:bottom w:val="single" w:color="CCCCCC" w:sz="1"/>
-              <w:right w:val="single" w:color="CCCCCC" w:sz="1"/>
-            </w:tcBorders>
-            <w:shd w:fill="F9F7F4" w:val="clear"/>
-            <w:tcMar>
-              <w:top w:type="dxa" w:w="80"/>
-              <w:left w:type="dxa" w:w="120"/>
-              <w:bottom w:type="dxa" w:w="80"/>
-              <w:right w:type="dxa" w:w="120"/>
-            </w:tcMar>
-          </w:tcPr>
-          <w:p>
-            <w:r>
-              <w:rPr>
-                <w:rFonts w:ascii="Arial" w:cs="Arial" w:eastAsia="Arial" w:hAnsi="Arial"/>
-                <w:b w:val="false"/>
-                <w:bCs w:val="false"/>
-                <w:color w:val="1A1208"/>
-                <w:sz w:val="18"/>
-                <w:szCs w:val="18"/>
-              </w:rPr>
-              <w:t xml:space="preserve">Scraper finished 100% — 37,980 rows, 34,952 fitment, 10,057 OEM, 0 errors. Run: VTWIN_CSV=./scripts/ingest/vtwin_fitment.csv node scripts/ingest/import_vtwin_fitment_partial.mjs --skip-existing</w:t>
+              <w:t xml:space="preserve">✅ VTwin full fitment import</w:t>
+            </w:r>
+          </w:p>
+        </w:tc>
+        <w:tc>
+          <w:tcPr>
+            <w:tcBorders>
+              <w:top w:val="single" w:color="CCCCCC" w:sz="1"/>
+              <w:left w:val="single" w:color="CCCCCC" w:sz="1"/>
+              <w:bottom w:val="single" w:color="CCCCCC" w:sz="1"/>
+              <w:right w:val="single" w:color="CCCCCC" w:sz="1"/>
+            </w:tcBorders>
+            <w:shd w:fill="F9F7F4" w:val="clear"/>
+            <w:tcMar>
+              <w:top w:type="dxa" w:w="80"/>
+              <w:left w:type="dxa" w:w="120"/>
+              <w:bottom w:type="dxa" w:w="80"/>
+              <w:right w:type="dxa" w:w="120"/>
+            </w:tcMar>
+          </w:tcPr>
+          <w:p>
+            <w:r>
+              <w:rPr>
+                <w:rFonts w:ascii="Arial" w:cs="Arial" w:eastAsia="Arial" w:hAnsi="Arial"/>
+                <w:b w:val="false"/>
+                <w:bCs w:val="false"/>
+                <w:color w:val="1A1208"/>
+                <w:sz w:val="18"/>
+                <w:szCs w:val="18"/>
+              </w:rPr>
+              <w:t xml:space="preserve">DONE June 4. Imported vtwin_fitment.csv (13,275 SKUs, 239,494 fitment rows) + vtwin_fitment_missing.csv (7,479 SKUs, 160,910 rows, 1,653 new products). Used import_vtwin_fitment_partial.mjs sequentially — parallel runs cause delete collisions. Typesense reindexed: 104,917 docs.</w:t>
             </w:r>
           </w:p>
         </w:tc>
@@ -517,37 +517,37 @@
                 <w:sz w:val="18"/>
                 <w:szCs w:val="18"/>
               </w:rPr>
-              <w:t xml:space="preserve">Add 26 missing model codes</w:t>
-            </w:r>
-          </w:p>
-        </w:tc>
-        <w:tc>
-          <w:tcPr>
-            <w:tcBorders>
-              <w:top w:val="single" w:color="CCCCCC" w:sz="1"/>
-              <w:left w:val="single" w:color="CCCCCC" w:sz="1"/>
-              <w:bottom w:val="single" w:color="CCCCCC" w:sz="1"/>
-              <w:right w:val="single" w:color="CCCCCC" w:sz="1"/>
-            </w:tcBorders>
-            <w:shd w:fill="F9F7F4" w:val="clear"/>
-            <w:tcMar>
-              <w:top w:type="dxa" w:w="80"/>
-              <w:left w:type="dxa" w:w="120"/>
-              <w:bottom w:type="dxa" w:w="80"/>
-              <w:right w:type="dxa" w:w="120"/>
-            </w:tcMar>
-          </w:tcPr>
-          <w:p>
-            <w:r>
-              <w:rPr>
-                <w:rFonts w:ascii="Arial" w:cs="Arial" w:eastAsia="Arial" w:hAnsi="Arial"/>
-                <w:b w:val="false"/>
-                <w:bCs w:val="false"/>
-                <w:color w:val="1A1208"/>
-                <w:sz w:val="18"/>
-                <w:szCs w:val="18"/>
-              </w:rPr>
-              <w:t xml:space="preserve">FLTRCVO, FLHTKCVO, FLHTCVO, FLTRXCVO, FLHXCVO (CVO Touring), FLFBSANY/V/X, FLHCSANV (CVO Softail), FXBSE, FXDE, FXDE, XG, RH120S, FLHXX, FXRST, FLHTKS, FXLRSST, FLTHK, FLTSN, FLTN, FXLRFLFB, FLFS. Skip ELW (bad data), XL1200 (generic).</w:t>
+              <w:t xml:space="preserve">✅ Add missing model codes</w:t>
+            </w:r>
+          </w:p>
+        </w:tc>
+        <w:tc>
+          <w:tcPr>
+            <w:tcBorders>
+              <w:top w:val="single" w:color="CCCCCC" w:sz="1"/>
+              <w:left w:val="single" w:color="CCCCCC" w:sz="1"/>
+              <w:bottom w:val="single" w:color="CCCCCC" w:sz="1"/>
+              <w:right w:val="single" w:color="CCCCCC" w:sz="1"/>
+            </w:tcBorders>
+            <w:shd w:fill="F9F7F4" w:val="clear"/>
+            <w:tcMar>
+              <w:top w:type="dxa" w:w="80"/>
+              <w:left w:type="dxa" w:w="120"/>
+              <w:bottom w:type="dxa" w:w="80"/>
+              <w:right w:type="dxa" w:w="120"/>
+            </w:tcMar>
+          </w:tcPr>
+          <w:p>
+            <w:r>
+              <w:rPr>
+                <w:rFonts w:ascii="Arial" w:cs="Arial" w:eastAsia="Arial" w:hAnsi="Arial"/>
+                <w:b w:val="false"/>
+                <w:bCs w:val="false"/>
+                <w:color w:val="1A1208"/>
+                <w:sz w:val="18"/>
+                <w:szCs w:val="18"/>
+              </w:rPr>
+              <w:t xml:space="preserve">DONE June 4. 22 model codes added to harley_models + 131 harley_model_years rows. CVO Touring (FLTRCVO/FLHTKCVO/FLHTCVO/FLTRXCVO/FLHXCVO), FLHTKS, FLHXX, FLTHK, FLTN, CVO Softail (FLFBSANY/V/X, FLHCSANV, FXBSE, FLFS, FLTSN, FXLRSST, FXRST), FXDE (Dyna), XG (Street), RH120S (Rev Max). Skipped: ELW, XL1200, C, E, FXLRFLFB. Fitment re-imported to capture previously-skipped rows.</w:t>
             </w:r>
           </w:p>
         </w:tc>
@@ -1135,6 +1135,235 @@
       <w:pPr>
         <w:pStyle w:val="Heading2"/>
         <w:spacing w:after="80" w:before="240"/>
+      </w:pPr>
+      <w:r>
+        <w:rPr>
+          <w:rFonts w:ascii="Arial" w:cs="Arial" w:eastAsia="Arial" w:hAnsi="Arial"/>
+          <w:b/>
+          <w:bCs/>
+          <w:color w:val="1A1208"/>
+          <w:sz w:val="24"/>
+          <w:szCs w:val="24"/>
+        </w:rPr>
+        <w:t xml:space="preserve">✅ DONE JUNE 4 — THIRTY-EIGHTH PASS</w:t>
+      </w:r>
+    </w:p>
+    <w:tbl>
+      <w:tblPr>
+        <w:tblW w:type="dxa" w:w="9360"/>
+        <w:tblBorders>
+          <w:top w:val="single" w:color="auto" w:sz="4"/>
+          <w:left w:val="single" w:color="auto" w:sz="4"/>
+          <w:bottom w:val="single" w:color="auto" w:sz="4"/>
+          <w:right w:val="single" w:color="auto" w:sz="4"/>
+          <w:insideH w:val="single" w:color="auto" w:sz="4"/>
+          <w:insideV w:val="single" w:color="auto" w:sz="4"/>
+        </w:tblBorders>
+      </w:tblPr>
+      <w:tblGrid>
+        <w:gridCol w:w="2480"/>
+        <w:gridCol w:w="6880"/>
+      </w:tblGrid>
+      <w:tr>
+        <w:trPr>
+          <w:tblHeader/>
+        </w:trPr>
+        <w:tc>
+          <w:tcPr>
+            <w:tcBorders>
+              <w:top w:val="single" w:color="CCCCCC" w:sz="1"/>
+              <w:left w:val="single" w:color="CCCCCC" w:sz="1"/>
+              <w:bottom w:val="single" w:color="CCCCCC" w:sz="1"/>
+              <w:right w:val="single" w:color="CCCCCC" w:sz="1"/>
+            </w:tcBorders>
+            <w:shd w:fill="1A1208" w:val="clear"/>
+            <w:tcMar>
+              <w:top w:type="dxa" w:w="80"/>
+              <w:left w:type="dxa" w:w="120"/>
+              <w:bottom w:type="dxa" w:w="80"/>
+              <w:right w:type="dxa" w:w="120"/>
+            </w:tcMar>
+          </w:tcPr>
+          <w:p>
+            <w:r>
+              <w:rPr>
+                <w:rFonts w:ascii="Arial" w:cs="Arial" w:eastAsia="Arial" w:hAnsi="Arial"/>
+                <w:b/>
+                <w:bCs/>
+                <w:color w:val="C9960A"/>
+                <w:sz w:val="18"/>
+                <w:szCs w:val="18"/>
+              </w:rPr>
+              <w:t xml:space="preserve">Area</w:t>
+            </w:r>
+          </w:p>
+        </w:tc>
+        <w:tc>
+          <w:tcPr>
+            <w:tcBorders>
+              <w:top w:val="single" w:color="CCCCCC" w:sz="1"/>
+              <w:left w:val="single" w:color="CCCCCC" w:sz="1"/>
+              <w:bottom w:val="single" w:color="CCCCCC" w:sz="1"/>
+              <w:right w:val="single" w:color="CCCCCC" w:sz="1"/>
+            </w:tcBorders>
+            <w:shd w:fill="1A1208" w:val="clear"/>
+            <w:tcMar>
+              <w:top w:type="dxa" w:w="80"/>
+              <w:left w:type="dxa" w:w="120"/>
+              <w:bottom w:type="dxa" w:w="80"/>
+              <w:right w:type="dxa" w:w="120"/>
+            </w:tcMar>
+          </w:tcPr>
+          <w:p>
+            <w:r>
+              <w:rPr>
+                <w:rFonts w:ascii="Arial" w:cs="Arial" w:eastAsia="Arial" w:hAnsi="Arial"/>
+                <w:b/>
+                <w:bCs/>
+                <w:color w:val="C9960A"/>
+                <w:sz w:val="18"/>
+                <w:szCs w:val="18"/>
+              </w:rPr>
+              <w:t xml:space="preserve">What Was Done</w:t>
+            </w:r>
+          </w:p>
+        </w:tc>
+      </w:tr>
+      <w:tr>
+        <w:trPr>
+          <w:tblHeader w:val="false"/>
+        </w:trPr>
+        <w:tc>
+          <w:tcPr>
+            <w:tcBorders>
+              <w:top w:val="single" w:color="CCCCCC" w:sz="1"/>
+              <w:left w:val="single" w:color="CCCCCC" w:sz="1"/>
+              <w:bottom w:val="single" w:color="CCCCCC" w:sz="1"/>
+              <w:right w:val="single" w:color="CCCCCC" w:sz="1"/>
+            </w:tcBorders>
+            <w:shd w:fill="F9F7F4" w:val="clear"/>
+            <w:tcMar>
+              <w:top w:type="dxa" w:w="80"/>
+              <w:left w:type="dxa" w:w="120"/>
+              <w:bottom w:type="dxa" w:w="80"/>
+              <w:right w:type="dxa" w:w="120"/>
+            </w:tcMar>
+          </w:tcPr>
+          <w:p>
+            <w:r>
+              <w:rPr>
+                <w:rFonts w:ascii="Arial" w:cs="Arial" w:eastAsia="Arial" w:hAnsi="Arial"/>
+                <w:b w:val="false"/>
+                <w:bCs w:val="false"/>
+                <w:color w:val="1A1208"/>
+                <w:sz w:val="18"/>
+                <w:szCs w:val="18"/>
+              </w:rPr>
+              <w:t xml:space="preserve">VTwin full fitment ingest</w:t>
+            </w:r>
+          </w:p>
+        </w:tc>
+        <w:tc>
+          <w:tcPr>
+            <w:tcBorders>
+              <w:top w:val="single" w:color="CCCCCC" w:sz="1"/>
+              <w:left w:val="single" w:color="CCCCCC" w:sz="1"/>
+              <w:bottom w:val="single" w:color="CCCCCC" w:sz="1"/>
+              <w:right w:val="single" w:color="CCCCCC" w:sz="1"/>
+            </w:tcBorders>
+            <w:shd w:fill="FFFFFF" w:val="clear"/>
+            <w:tcMar>
+              <w:top w:type="dxa" w:w="80"/>
+              <w:left w:type="dxa" w:w="120"/>
+              <w:bottom w:type="dxa" w:w="80"/>
+              <w:right w:type="dxa" w:w="120"/>
+            </w:tcMar>
+          </w:tcPr>
+          <w:p>
+            <w:r>
+              <w:rPr>
+                <w:rFonts w:ascii="Arial" w:cs="Arial" w:eastAsia="Arial" w:hAnsi="Arial"/>
+                <w:b w:val="false"/>
+                <w:bCs w:val="false"/>
+                <w:color w:val="1A1208"/>
+                <w:sz w:val="18"/>
+                <w:szCs w:val="18"/>
+              </w:rPr>
+              <w:t xml:space="preserve">Imported vtwin_fitment.csv (13,275 SKUs, 239,494 fitment rows) + vtwin_fitment_missing.csv (7,479 SKUs, 160,910 rows, 1,653 net-new products added to catalog). Sequential import required — parallel runs cause delete/reinsert collisions. Fixed 1,653 null slugs, synced catalog_products. Typesense reindexed: 104,917 docs.</w:t>
+            </w:r>
+          </w:p>
+        </w:tc>
+      </w:tr>
+      <w:tr>
+        <w:trPr>
+          <w:tblHeader w:val="false"/>
+        </w:trPr>
+        <w:tc>
+          <w:tcPr>
+            <w:tcBorders>
+              <w:top w:val="single" w:color="CCCCCC" w:sz="1"/>
+              <w:left w:val="single" w:color="CCCCCC" w:sz="1"/>
+              <w:bottom w:val="single" w:color="CCCCCC" w:sz="1"/>
+              <w:right w:val="single" w:color="CCCCCC" w:sz="1"/>
+            </w:tcBorders>
+            <w:shd w:fill="F9F7F4" w:val="clear"/>
+            <w:tcMar>
+              <w:top w:type="dxa" w:w="80"/>
+              <w:left w:type="dxa" w:w="120"/>
+              <w:bottom w:type="dxa" w:w="80"/>
+              <w:right w:type="dxa" w:w="120"/>
+            </w:tcMar>
+          </w:tcPr>
+          <w:p>
+            <w:r>
+              <w:rPr>
+                <w:rFonts w:ascii="Arial" w:cs="Arial" w:eastAsia="Arial" w:hAnsi="Arial"/>
+                <w:b w:val="false"/>
+                <w:bCs w:val="false"/>
+                <w:color w:val="1A1208"/>
+                <w:sz w:val="18"/>
+                <w:szCs w:val="18"/>
+              </w:rPr>
+              <w:t xml:space="preserve">22 missing model codes added</w:t>
+            </w:r>
+          </w:p>
+        </w:tc>
+        <w:tc>
+          <w:tcPr>
+            <w:tcBorders>
+              <w:top w:val="single" w:color="CCCCCC" w:sz="1"/>
+              <w:left w:val="single" w:color="CCCCCC" w:sz="1"/>
+              <w:bottom w:val="single" w:color="CCCCCC" w:sz="1"/>
+              <w:right w:val="single" w:color="CCCCCC" w:sz="1"/>
+            </w:tcBorders>
+            <w:shd w:fill="FFFFFF" w:val="clear"/>
+            <w:tcMar>
+              <w:top w:type="dxa" w:w="80"/>
+              <w:left w:type="dxa" w:w="120"/>
+              <w:bottom w:type="dxa" w:w="80"/>
+              <w:right w:type="dxa" w:w="120"/>
+            </w:tcMar>
+          </w:tcPr>
+          <w:p>
+            <w:r>
+              <w:rPr>
+                <w:rFonts w:ascii="Arial" w:cs="Arial" w:eastAsia="Arial" w:hAnsi="Arial"/>
+                <w:b w:val="false"/>
+                <w:bCs w:val="false"/>
+                <w:color w:val="1A1208"/>
+                <w:sz w:val="18"/>
+                <w:szCs w:val="18"/>
+              </w:rPr>
+              <w:t xml:space="preserve">22 of 26 model codes added to harley_models + 131 harley_model_years rows via generate_series. CVO Touring (5 codes), FLHTKS, FLHXX, FLTHK, FLTN, CVO/Softail variants (8 codes), FXDE (Dyna), XG (Street), RH120S (Rev Max). Skipped permanently: ELW (bad data), XL1200 (generic), C/E (noise), FXLRFLFB (parse error).</w:t>
+            </w:r>
+          </w:p>
+        </w:tc>
+      </w:tr>
+    </w:tbl>
+    <w:p/>
+    <w:p>
+      <w:pPr>
+        <w:spacing w:before="200" w:after="100"/>
       </w:pPr>
       <w:r>
         <w:rPr>

</xml_diff>